<commit_message>
Refresh OpenAPI + test suites for v3.2-reconciled modules (G01/02/03/08/13/14)
Sync the API contracts and acceptance tests to the field-reconciled schema/BRDs:
- OpenAPI: +79 paths (G01 +12, G03 +18, G08 +25, G13 +23, G02 pii_tier field, G14 HOURS unit)
  → 1,132 paths / 1,306 operations across 14 specs, all parse as OpenAPI 3.1
- Tests: +67 cases (G01 130→148, G02 92→96, G03 143→157, G08 122→138, G13 110→122,
  G14 105→108) → 1,597 total; cover the new entities/endpoints with happy+negative paths
  asserting exact error codes; traceability + coverage counts updated; re-rendered to .docx
Add-only; existing paths/schemas/test cases preserved.

Co-Authored-By: Claude Opus 4.8 (1M context) <noreply@anthropic.com>
</commit_message>
<xml_diff>
--- a/docs/tests/docx/G01-employee-profile-tests.docx
+++ b/docs/tests/docx/G01-employee-profile-tests.docx
@@ -102,7 +102,7 @@
         <w:t>docs/brd/v3/G01-employee-profile-management.md</w:t>
       </w:r>
       <w:r>
-        <w:t>, v3.1)</w:t>
+        <w:t>, v3.1; v3.2 field-reconciliation additions covered by TC-G01-131 … 148)</w:t>
       </w:r>
     </w:p>
     <w:p>
@@ -20388,6 +20388,3217 @@
     </w:p>
     <w:p>
       <w:pPr>
+        <w:pStyle w:val="Heading3"/>
+      </w:pPr>
+      <w:r>
+        <w:rPr>
+          <w:b/>
+          <w:color w:val="2E5B9E"/>
+          <w:sz w:val="26"/>
+        </w:rPr>
+        <w:t>v3.2 Field-Reconciliation Additions (National-ID master + profile satellites)</w:t>
+      </w:r>
+    </w:p>
+    <w:p>
+      <w:r>
+        <w:t xml:space="preserve">*New cases for the v3.2 additive schema sync (BRD Amendments v3.1 → v3.2; SQL SECTION 6/7). Endpoints and fields grounded in </w:t>
+      </w:r>
+      <w:r>
+        <w:rPr>
+          <w:rFonts w:ascii="Consolas" w:hAnsi="Consolas"/>
+          <w:sz w:val="20"/>
+        </w:rPr>
+        <w:t>docs/contracts/openapi/G01.yaml</w:t>
+      </w:r>
+      <w:r>
+        <w:t xml:space="preserve"> v3.2 additions; error codes reuse the existing taxonomy.*</w:t>
+      </w:r>
+    </w:p>
+    <w:p>
+      <w:pPr>
+        <w:pStyle w:val="Heading4"/>
+      </w:pPr>
+      <w:r>
+        <w:rPr>
+          <w:b/>
+          <w:color w:val="2E5B9E"/>
+          <w:sz w:val="24"/>
+        </w:rPr>
+        <w:t>TC-G01-131</w:t>
+      </w:r>
+    </w:p>
+    <w:p>
+      <w:pPr>
+        <w:pStyle w:val="ListBullet"/>
+      </w:pPr>
+      <w:r>
+        <w:rPr>
+          <w:b/>
+        </w:rPr>
+        <w:t>Traces-to:</w:t>
+      </w:r>
+      <w:r>
+        <w:t xml:space="preserve"> FR-EPM-007 (v3.2 F1, </w:t>
+      </w:r>
+      <w:r>
+        <w:rPr>
+          <w:rFonts w:ascii="Consolas" w:hAnsi="Consolas"/>
+          <w:sz w:val="20"/>
+        </w:rPr>
+        <w:t>national_id_types</w:t>
+      </w:r>
+      <w:r>
+        <w:t xml:space="preserve">); </w:t>
+      </w:r>
+      <w:r>
+        <w:rPr>
+          <w:rFonts w:ascii="Consolas" w:hAnsi="Consolas"/>
+          <w:sz w:val="20"/>
+        </w:rPr>
+        <w:t>POST /national-id-types</w:t>
+      </w:r>
+      <w:r>
+        <w:t xml:space="preserve">, </w:t>
+      </w:r>
+      <w:r>
+        <w:rPr>
+          <w:rFonts w:ascii="Consolas" w:hAnsi="Consolas"/>
+          <w:sz w:val="20"/>
+        </w:rPr>
+        <w:t>GET /national-id-types</w:t>
+      </w:r>
+    </w:p>
+    <w:p>
+      <w:pPr>
+        <w:pStyle w:val="ListBullet"/>
+      </w:pPr>
+      <w:r>
+        <w:rPr>
+          <w:b/>
+        </w:rPr>
+        <w:t>Type:</w:t>
+      </w:r>
+      <w:r>
+        <w:t xml:space="preserve"> Functional · </w:t>
+      </w:r>
+      <w:r>
+        <w:rPr>
+          <w:b/>
+        </w:rPr>
+        <w:t>Priority:</w:t>
+      </w:r>
+      <w:r>
+        <w:t xml:space="preserve"> P2</w:t>
+      </w:r>
+    </w:p>
+    <w:p>
+      <w:pPr>
+        <w:pStyle w:val="ListBullet"/>
+      </w:pPr>
+      <w:r>
+        <w:rPr>
+          <w:b/>
+        </w:rPr>
+        <w:t>Title:</w:t>
+      </w:r>
+      <w:r>
+        <w:t xml:space="preserve"> Configure a National-ID type and list it (cursor)</w:t>
+      </w:r>
+    </w:p>
+    <w:p>
+      <w:pPr>
+        <w:pStyle w:val="ListBullet"/>
+      </w:pPr>
+      <w:r>
+        <w:rPr>
+          <w:b/>
+        </w:rPr>
+        <w:t>Steps:</w:t>
+      </w:r>
+      <w:r>
+        <w:t xml:space="preserve"> 1. </w:t>
+      </w:r>
+      <w:r>
+        <w:rPr>
+          <w:rFonts w:ascii="Consolas" w:hAnsi="Consolas"/>
+          <w:sz w:val="20"/>
+        </w:rPr>
+        <w:t>u_hradmin1</w:t>
+      </w:r>
+      <w:r>
+        <w:t xml:space="preserve"> </w:t>
+      </w:r>
+      <w:r>
+        <w:rPr>
+          <w:rFonts w:ascii="Consolas" w:hAnsi="Consolas"/>
+          <w:sz w:val="20"/>
+        </w:rPr>
+        <w:t>POST /api/v1/national-id-types</w:t>
+      </w:r>
+      <w:r>
+        <w:t xml:space="preserve"> {id_code:"pran_number", label:"PRAN", applicable_for:"All Employees", is_enabled:true, temporary_id_enabled:true, is_unique:true, maps_to_doc_type:null} + Idempotency-Key. 2. </w:t>
+      </w:r>
+      <w:r>
+        <w:rPr>
+          <w:rFonts w:ascii="Consolas" w:hAnsi="Consolas"/>
+          <w:sz w:val="20"/>
+        </w:rPr>
+        <w:t>GET /api/v1/national-id-types?enabled=true</w:t>
+      </w:r>
+      <w:r>
+        <w:t>.</w:t>
+      </w:r>
+    </w:p>
+    <w:p>
+      <w:pPr>
+        <w:pStyle w:val="ListBullet"/>
+      </w:pPr>
+      <w:r>
+        <w:rPr>
+          <w:b/>
+        </w:rPr>
+        <w:t>Expected result:</w:t>
+      </w:r>
+      <w:r>
+        <w:t xml:space="preserve"> </w:t>
+      </w:r>
+      <w:r>
+        <w:rPr>
+          <w:rFonts w:ascii="Consolas" w:hAnsi="Consolas"/>
+          <w:sz w:val="20"/>
+        </w:rPr>
+        <w:t>201</w:t>
+      </w:r>
+      <w:r>
+        <w:t xml:space="preserve"> with </w:t>
+      </w:r>
+      <w:r>
+        <w:rPr>
+          <w:rFonts w:ascii="Consolas" w:hAnsi="Consolas"/>
+          <w:sz w:val="20"/>
+        </w:rPr>
+        <w:t>national_id_type_id</w:t>
+      </w:r>
+      <w:r>
+        <w:t xml:space="preserve">, </w:t>
+      </w:r>
+      <w:r>
+        <w:rPr>
+          <w:rFonts w:ascii="Consolas" w:hAnsi="Consolas"/>
+          <w:sz w:val="20"/>
+        </w:rPr>
+        <w:t>row_version=1</w:t>
+      </w:r>
+      <w:r>
+        <w:t xml:space="preserve">, echoed config flags; list </w:t>
+      </w:r>
+      <w:r>
+        <w:rPr>
+          <w:rFonts w:ascii="Consolas" w:hAnsi="Consolas"/>
+          <w:sz w:val="20"/>
+        </w:rPr>
+        <w:t>200</w:t>
+      </w:r>
+      <w:r>
+        <w:t xml:space="preserve"> returns the type in </w:t>
+      </w:r>
+      <w:r>
+        <w:rPr>
+          <w:rFonts w:ascii="Consolas" w:hAnsi="Consolas"/>
+          <w:sz w:val="20"/>
+        </w:rPr>
+        <w:t>items</w:t>
+      </w:r>
+      <w:r>
+        <w:t xml:space="preserve"> with </w:t>
+      </w:r>
+      <w:r>
+        <w:rPr>
+          <w:rFonts w:ascii="Consolas" w:hAnsi="Consolas"/>
+          <w:sz w:val="20"/>
+        </w:rPr>
+        <w:t>next_cursor</w:t>
+      </w:r>
+      <w:r>
+        <w:t xml:space="preserve"> present (cursor shape); </w:t>
+      </w:r>
+      <w:r>
+        <w:rPr>
+          <w:rFonts w:ascii="Consolas" w:hAnsi="Consolas"/>
+          <w:sz w:val="20"/>
+        </w:rPr>
+        <w:t>X-Correlation-Id</w:t>
+      </w:r>
+      <w:r>
+        <w:t xml:space="preserve"> header on both.</w:t>
+      </w:r>
+    </w:p>
+    <w:p>
+      <w:pPr>
+        <w:pStyle w:val="Heading4"/>
+      </w:pPr>
+      <w:r>
+        <w:rPr>
+          <w:b/>
+          <w:color w:val="2E5B9E"/>
+          <w:sz w:val="24"/>
+        </w:rPr>
+        <w:t>TC-G01-132</w:t>
+      </w:r>
+    </w:p>
+    <w:p>
+      <w:pPr>
+        <w:pStyle w:val="ListBullet"/>
+      </w:pPr>
+      <w:r>
+        <w:rPr>
+          <w:b/>
+        </w:rPr>
+        <w:t>Traces-to:</w:t>
+      </w:r>
+      <w:r>
+        <w:t xml:space="preserve"> FR-EPM-007 (v3.2); </w:t>
+      </w:r>
+      <w:r>
+        <w:rPr>
+          <w:rFonts w:ascii="Consolas" w:hAnsi="Consolas"/>
+          <w:sz w:val="20"/>
+        </w:rPr>
+        <w:t>uq_national_id_types_code</w:t>
+      </w:r>
+      <w:r>
+        <w:t xml:space="preserve"> (unique per tenant); error-taxonomy CONFLICT</w:t>
+      </w:r>
+    </w:p>
+    <w:p>
+      <w:pPr>
+        <w:pStyle w:val="ListBullet"/>
+      </w:pPr>
+      <w:r>
+        <w:rPr>
+          <w:b/>
+        </w:rPr>
+        <w:t>Type:</w:t>
+      </w:r>
+      <w:r>
+        <w:t xml:space="preserve"> Negative · </w:t>
+      </w:r>
+      <w:r>
+        <w:rPr>
+          <w:b/>
+        </w:rPr>
+        <w:t>Priority:</w:t>
+      </w:r>
+      <w:r>
+        <w:t xml:space="preserve"> P2</w:t>
+      </w:r>
+    </w:p>
+    <w:p>
+      <w:pPr>
+        <w:pStyle w:val="ListBullet"/>
+      </w:pPr>
+      <w:r>
+        <w:rPr>
+          <w:b/>
+        </w:rPr>
+        <w:t>Title:</w:t>
+      </w:r>
+      <w:r>
+        <w:t xml:space="preserve"> Duplicate national-ID </w:t>
+      </w:r>
+      <w:r>
+        <w:rPr>
+          <w:rFonts w:ascii="Consolas" w:hAnsi="Consolas"/>
+          <w:sz w:val="20"/>
+        </w:rPr>
+        <w:t>id_code</w:t>
+      </w:r>
+      <w:r>
+        <w:t xml:space="preserve"> within a tenant is rejected</w:t>
+      </w:r>
+    </w:p>
+    <w:p>
+      <w:pPr>
+        <w:pStyle w:val="ListBullet"/>
+      </w:pPr>
+      <w:r>
+        <w:rPr>
+          <w:b/>
+        </w:rPr>
+        <w:t>Steps:</w:t>
+      </w:r>
+      <w:r>
+        <w:t xml:space="preserve"> 1. </w:t>
+      </w:r>
+      <w:r>
+        <w:rPr>
+          <w:rFonts w:ascii="Consolas" w:hAnsi="Consolas"/>
+          <w:sz w:val="20"/>
+        </w:rPr>
+        <w:t>POST /api/v1/national-id-types</w:t>
+      </w:r>
+      <w:r>
+        <w:t xml:space="preserve"> with </w:t>
+      </w:r>
+      <w:r>
+        <w:rPr>
+          <w:rFonts w:ascii="Consolas" w:hAnsi="Consolas"/>
+          <w:sz w:val="20"/>
+        </w:rPr>
+        <w:t>id_code="pran_number"</w:t>
+      </w:r>
+      <w:r>
+        <w:t xml:space="preserve"> a second time in TEN-1.</w:t>
+      </w:r>
+    </w:p>
+    <w:p>
+      <w:pPr>
+        <w:pStyle w:val="ListBullet"/>
+      </w:pPr>
+      <w:r>
+        <w:rPr>
+          <w:b/>
+        </w:rPr>
+        <w:t>Expected result:</w:t>
+      </w:r>
+      <w:r>
+        <w:t xml:space="preserve"> </w:t>
+      </w:r>
+      <w:r>
+        <w:rPr>
+          <w:rFonts w:ascii="Consolas" w:hAnsi="Consolas"/>
+          <w:sz w:val="20"/>
+        </w:rPr>
+        <w:t>409 CONFLICT</w:t>
+      </w:r>
+      <w:r>
+        <w:t xml:space="preserve">; canonical envelope; no second row created; </w:t>
+      </w:r>
+      <w:r>
+        <w:rPr>
+          <w:rFonts w:ascii="Consolas" w:hAnsi="Consolas"/>
+          <w:sz w:val="20"/>
+        </w:rPr>
+        <w:t>X-Correlation-Id</w:t>
+      </w:r>
+      <w:r>
+        <w:t xml:space="preserve"> present.</w:t>
+      </w:r>
+    </w:p>
+    <w:p>
+      <w:pPr>
+        <w:pStyle w:val="Heading4"/>
+      </w:pPr>
+      <w:r>
+        <w:rPr>
+          <w:b/>
+          <w:color w:val="2E5B9E"/>
+          <w:sz w:val="24"/>
+        </w:rPr>
+        <w:t>TC-G01-133</w:t>
+      </w:r>
+    </w:p>
+    <w:p>
+      <w:pPr>
+        <w:pStyle w:val="ListBullet"/>
+      </w:pPr>
+      <w:r>
+        <w:rPr>
+          <w:b/>
+        </w:rPr>
+        <w:t>Traces-to:</w:t>
+      </w:r>
+      <w:r>
+        <w:t xml:space="preserve"> FR-EPM-007 (v3.2 F7); </w:t>
+      </w:r>
+      <w:r>
+        <w:rPr>
+          <w:rFonts w:ascii="Consolas" w:hAnsi="Consolas"/>
+          <w:sz w:val="20"/>
+        </w:rPr>
+        <w:t>employee_identity_documents.national_id_type_id</w:t>
+      </w:r>
+      <w:r>
+        <w:t xml:space="preserve"> / </w:t>
+      </w:r>
+      <w:r>
+        <w:rPr>
+          <w:rFonts w:ascii="Consolas" w:hAnsi="Consolas"/>
+          <w:sz w:val="20"/>
+        </w:rPr>
+        <w:t>is_temporary_id</w:t>
+      </w:r>
+      <w:r>
+        <w:t xml:space="preserve"> / </w:t>
+      </w:r>
+      <w:r>
+        <w:rPr>
+          <w:rFonts w:ascii="Consolas" w:hAnsi="Consolas"/>
+          <w:sz w:val="20"/>
+        </w:rPr>
+        <w:t>temporary_id_value</w:t>
+      </w:r>
+      <w:r>
+        <w:t xml:space="preserve">; </w:t>
+      </w:r>
+      <w:r>
+        <w:rPr>
+          <w:rFonts w:ascii="Consolas" w:hAnsi="Consolas"/>
+          <w:sz w:val="20"/>
+        </w:rPr>
+        <w:t>POST /employees/{id}/identity-docs</w:t>
+      </w:r>
+    </w:p>
+    <w:p>
+      <w:pPr>
+        <w:pStyle w:val="ListBullet"/>
+      </w:pPr>
+      <w:r>
+        <w:rPr>
+          <w:b/>
+        </w:rPr>
+        <w:t>Type:</w:t>
+      </w:r>
+      <w:r>
+        <w:t xml:space="preserve"> Functional · </w:t>
+      </w:r>
+      <w:r>
+        <w:rPr>
+          <w:b/>
+        </w:rPr>
+        <w:t>Priority:</w:t>
+      </w:r>
+      <w:r>
+        <w:t xml:space="preserve"> P1</w:t>
+      </w:r>
+    </w:p>
+    <w:p>
+      <w:pPr>
+        <w:pStyle w:val="ListBullet"/>
+      </w:pPr>
+      <w:r>
+        <w:rPr>
+          <w:b/>
+        </w:rPr>
+        <w:t>Title:</w:t>
+      </w:r>
+      <w:r>
+        <w:t xml:space="preserve"> Identity document linked to a configurable national_id_type with a temporary ID</w:t>
+      </w:r>
+    </w:p>
+    <w:p>
+      <w:pPr>
+        <w:pStyle w:val="ListBullet"/>
+      </w:pPr>
+      <w:r>
+        <w:rPr>
+          <w:b/>
+        </w:rPr>
+        <w:t>Steps:</w:t>
+      </w:r>
+      <w:r>
+        <w:t xml:space="preserve"> 1. </w:t>
+      </w:r>
+      <w:r>
+        <w:rPr>
+          <w:rFonts w:ascii="Consolas" w:hAnsi="Consolas"/>
+          <w:sz w:val="20"/>
+        </w:rPr>
+        <w:t>u_hradmin1</w:t>
+      </w:r>
+      <w:r>
+        <w:t xml:space="preserve"> </w:t>
+      </w:r>
+      <w:r>
+        <w:rPr>
+          <w:rFonts w:ascii="Consolas" w:hAnsi="Consolas"/>
+          <w:sz w:val="20"/>
+        </w:rPr>
+        <w:t>POST /api/v1/employees/{EMP-1001}/identity-docs</w:t>
+      </w:r>
+      <w:r>
+        <w:t xml:space="preserve"> {type:"AADHAAR", national_id_type_id:&lt;Aadhaar type id&gt;, is_temporary_id:true, temporary_id_value:"TMP-AAD-9931"} + Idempotency-Key.</w:t>
+      </w:r>
+    </w:p>
+    <w:p>
+      <w:pPr>
+        <w:pStyle w:val="ListBullet"/>
+      </w:pPr>
+      <w:r>
+        <w:rPr>
+          <w:b/>
+        </w:rPr>
+        <w:t>Expected result:</w:t>
+      </w:r>
+      <w:r>
+        <w:t xml:space="preserve"> </w:t>
+      </w:r>
+      <w:r>
+        <w:rPr>
+          <w:rFonts w:ascii="Consolas" w:hAnsi="Consolas"/>
+          <w:sz w:val="20"/>
+        </w:rPr>
+        <w:t>201</w:t>
+      </w:r>
+      <w:r>
+        <w:t>; response is masked (</w:t>
+      </w:r>
+      <w:r>
+        <w:rPr>
+          <w:rFonts w:ascii="Consolas" w:hAnsi="Consolas"/>
+          <w:sz w:val="20"/>
+        </w:rPr>
+        <w:t>number_masked</w:t>
+      </w:r>
+      <w:r>
+        <w:t xml:space="preserve">; raw </w:t>
+      </w:r>
+      <w:r>
+        <w:rPr>
+          <w:rFonts w:ascii="Consolas" w:hAnsi="Consolas"/>
+          <w:sz w:val="20"/>
+        </w:rPr>
+        <w:t>*_token</w:t>
+      </w:r>
+      <w:r>
+        <w:t xml:space="preserve"> never surfaces); </w:t>
+      </w:r>
+      <w:r>
+        <w:rPr>
+          <w:rFonts w:ascii="Consolas" w:hAnsi="Consolas"/>
+          <w:sz w:val="20"/>
+        </w:rPr>
+        <w:t>national_id_type_id</w:t>
+      </w:r>
+      <w:r>
+        <w:t xml:space="preserve"> echoed, </w:t>
+      </w:r>
+      <w:r>
+        <w:rPr>
+          <w:rFonts w:ascii="Consolas" w:hAnsi="Consolas"/>
+          <w:sz w:val="20"/>
+        </w:rPr>
+        <w:t>is_temporary_id=true</w:t>
+      </w:r>
+      <w:r>
+        <w:t xml:space="preserve">, </w:t>
+      </w:r>
+      <w:r>
+        <w:rPr>
+          <w:rFonts w:ascii="Consolas" w:hAnsi="Consolas"/>
+          <w:sz w:val="20"/>
+        </w:rPr>
+        <w:t>temporary_id_value</w:t>
+      </w:r>
+      <w:r>
+        <w:t xml:space="preserve"> retained; mandatory/masking behaviour driven by the linked type.</w:t>
+      </w:r>
+    </w:p>
+    <w:p>
+      <w:pPr>
+        <w:pStyle w:val="Heading4"/>
+      </w:pPr>
+      <w:r>
+        <w:rPr>
+          <w:b/>
+          <w:color w:val="2E5B9E"/>
+          <w:sz w:val="24"/>
+        </w:rPr>
+        <w:t>TC-G01-134</w:t>
+      </w:r>
+    </w:p>
+    <w:p>
+      <w:pPr>
+        <w:pStyle w:val="ListBullet"/>
+      </w:pPr>
+      <w:r>
+        <w:rPr>
+          <w:b/>
+        </w:rPr>
+        <w:t>Traces-to:</w:t>
+      </w:r>
+      <w:r>
+        <w:t xml:space="preserve"> FR-EPM-007 AC (VAL-AADHAAR/VAL-PAN); error-taxonomy </w:t>
+      </w:r>
+      <w:r>
+        <w:rPr>
+          <w:rFonts w:ascii="Consolas" w:hAnsi="Consolas"/>
+          <w:sz w:val="20"/>
+        </w:rPr>
+        <w:t>ERR-G01-IDFMT</w:t>
+      </w:r>
+      <w:r>
+        <w:t xml:space="preserve"> / reason </w:t>
+      </w:r>
+      <w:r>
+        <w:rPr>
+          <w:rFonts w:ascii="Consolas" w:hAnsi="Consolas"/>
+          <w:sz w:val="20"/>
+        </w:rPr>
+        <w:t>INVALID_ID</w:t>
+      </w:r>
+    </w:p>
+    <w:p>
+      <w:pPr>
+        <w:pStyle w:val="ListBullet"/>
+      </w:pPr>
+      <w:r>
+        <w:rPr>
+          <w:b/>
+        </w:rPr>
+        <w:t>Type:</w:t>
+      </w:r>
+      <w:r>
+        <w:t xml:space="preserve"> Negative · </w:t>
+      </w:r>
+      <w:r>
+        <w:rPr>
+          <w:b/>
+        </w:rPr>
+        <w:t>Priority:</w:t>
+      </w:r>
+      <w:r>
+        <w:t xml:space="preserve"> P1</w:t>
+      </w:r>
+    </w:p>
+    <w:p>
+      <w:pPr>
+        <w:pStyle w:val="ListBullet"/>
+      </w:pPr>
+      <w:r>
+        <w:rPr>
+          <w:b/>
+        </w:rPr>
+        <w:t>Title:</w:t>
+      </w:r>
+      <w:r>
+        <w:t xml:space="preserve"> Statutory-ID checksum failure on a typed identity document</w:t>
+      </w:r>
+    </w:p>
+    <w:p>
+      <w:pPr>
+        <w:pStyle w:val="ListBullet"/>
+      </w:pPr>
+      <w:r>
+        <w:rPr>
+          <w:b/>
+        </w:rPr>
+        <w:t>Steps:</w:t>
+      </w:r>
+      <w:r>
+        <w:t xml:space="preserve"> 1. </w:t>
+      </w:r>
+      <w:r>
+        <w:rPr>
+          <w:rFonts w:ascii="Consolas" w:hAnsi="Consolas"/>
+          <w:sz w:val="20"/>
+        </w:rPr>
+        <w:t>POST /api/v1/employees/{EMP-1001}/identity-docs</w:t>
+      </w:r>
+      <w:r>
+        <w:t xml:space="preserve"> {type:"PAN", national_id_type_id:&lt;PAN type id&gt;, number:"AAAAA0000A-bad"}.</w:t>
+      </w:r>
+    </w:p>
+    <w:p>
+      <w:pPr>
+        <w:pStyle w:val="ListBullet"/>
+      </w:pPr>
+      <w:r>
+        <w:rPr>
+          <w:b/>
+        </w:rPr>
+        <w:t>Expected result:</w:t>
+      </w:r>
+      <w:r>
+        <w:t xml:space="preserve"> </w:t>
+      </w:r>
+      <w:r>
+        <w:rPr>
+          <w:rFonts w:ascii="Consolas" w:hAnsi="Consolas"/>
+          <w:sz w:val="20"/>
+        </w:rPr>
+        <w:t>422 VALIDATION_FAILED</w:t>
+      </w:r>
+      <w:r>
+        <w:t xml:space="preserve">; </w:t>
+      </w:r>
+      <w:r>
+        <w:rPr>
+          <w:rFonts w:ascii="Consolas" w:hAnsi="Consolas"/>
+          <w:sz w:val="20"/>
+        </w:rPr>
+        <w:t>error.code=VALIDATION_FAILED</w:t>
+      </w:r>
+      <w:r>
+        <w:t xml:space="preserve">, message id </w:t>
+      </w:r>
+      <w:r>
+        <w:rPr>
+          <w:rFonts w:ascii="Consolas" w:hAnsi="Consolas"/>
+          <w:sz w:val="20"/>
+        </w:rPr>
+        <w:t>ERR-G01-IDFMT</w:t>
+      </w:r>
+      <w:r>
+        <w:t xml:space="preserve">, </w:t>
+      </w:r>
+      <w:r>
+        <w:rPr>
+          <w:rFonts w:ascii="Consolas" w:hAnsi="Consolas"/>
+          <w:sz w:val="20"/>
+        </w:rPr>
+        <w:t>details.reason="INVALID_ID"</w:t>
+      </w:r>
+      <w:r>
+        <w:t>; nothing persisted.</w:t>
+      </w:r>
+    </w:p>
+    <w:p>
+      <w:pPr>
+        <w:pStyle w:val="Heading4"/>
+      </w:pPr>
+      <w:r>
+        <w:rPr>
+          <w:b/>
+          <w:color w:val="2E5B9E"/>
+          <w:sz w:val="24"/>
+        </w:rPr>
+        <w:t>TC-G01-135</w:t>
+      </w:r>
+    </w:p>
+    <w:p>
+      <w:pPr>
+        <w:pStyle w:val="ListBullet"/>
+      </w:pPr>
+      <w:r>
+        <w:rPr>
+          <w:b/>
+        </w:rPr>
+        <w:t>Traces-to:</w:t>
+      </w:r>
+      <w:r>
+        <w:t xml:space="preserve"> FR-EPM-006 (v3.2 F4, </w:t>
+      </w:r>
+      <w:r>
+        <w:rPr>
+          <w:rFonts w:ascii="Consolas" w:hAnsi="Consolas"/>
+          <w:sz w:val="20"/>
+        </w:rPr>
+        <w:t>employee_visas</w:t>
+      </w:r>
+      <w:r>
+        <w:t xml:space="preserve">); </w:t>
+      </w:r>
+      <w:r>
+        <w:rPr>
+          <w:rFonts w:ascii="Consolas" w:hAnsi="Consolas"/>
+          <w:sz w:val="20"/>
+        </w:rPr>
+        <w:t>POST /employees/{id}/visas</w:t>
+      </w:r>
+      <w:r>
+        <w:t xml:space="preserve">, </w:t>
+      </w:r>
+      <w:r>
+        <w:rPr>
+          <w:rFonts w:ascii="Consolas" w:hAnsi="Consolas"/>
+          <w:sz w:val="20"/>
+        </w:rPr>
+        <w:t>GET /employees/{id}/visas</w:t>
+      </w:r>
+    </w:p>
+    <w:p>
+      <w:pPr>
+        <w:pStyle w:val="ListBullet"/>
+      </w:pPr>
+      <w:r>
+        <w:rPr>
+          <w:b/>
+        </w:rPr>
+        <w:t>Type:</w:t>
+      </w:r>
+      <w:r>
+        <w:t xml:space="preserve"> Functional · </w:t>
+      </w:r>
+      <w:r>
+        <w:rPr>
+          <w:b/>
+        </w:rPr>
+        <w:t>Priority:</w:t>
+      </w:r>
+      <w:r>
+        <w:t xml:space="preserve"> P2</w:t>
+      </w:r>
+    </w:p>
+    <w:p>
+      <w:pPr>
+        <w:pStyle w:val="ListBullet"/>
+      </w:pPr>
+      <w:r>
+        <w:rPr>
+          <w:b/>
+        </w:rPr>
+        <w:t>Title:</w:t>
+      </w:r>
+      <w:r>
+        <w:t xml:space="preserve"> Add and list an employee visa / work-permit</w:t>
+      </w:r>
+    </w:p>
+    <w:p>
+      <w:pPr>
+        <w:pStyle w:val="ListBullet"/>
+      </w:pPr>
+      <w:r>
+        <w:rPr>
+          <w:b/>
+        </w:rPr>
+        <w:t>Steps:</w:t>
+      </w:r>
+      <w:r>
+        <w:t xml:space="preserve"> 1. </w:t>
+      </w:r>
+      <w:r>
+        <w:rPr>
+          <w:rFonts w:ascii="Consolas" w:hAnsi="Consolas"/>
+          <w:sz w:val="20"/>
+        </w:rPr>
+        <w:t>POST /api/v1/employees/{EMP-1001}/visas</w:t>
+      </w:r>
+      <w:r>
+        <w:t xml:space="preserve"> {country:"Singapore", visa_type:"Employment Pass", visa_number:"EP-4471228", issue_date:"2025-02-10", valid_till:"2027-02-09", sponsor_type:"EXTERNAL_SPONSOR", sponsored_by:"PrimeSoft Pte Ltd"} + Idempotency-Key. 2. </w:t>
+      </w:r>
+      <w:r>
+        <w:rPr>
+          <w:rFonts w:ascii="Consolas" w:hAnsi="Consolas"/>
+          <w:sz w:val="20"/>
+        </w:rPr>
+        <w:t>GET /api/v1/employees/{EMP-1001}/visas</w:t>
+      </w:r>
+      <w:r>
+        <w:t>.</w:t>
+      </w:r>
+    </w:p>
+    <w:p>
+      <w:pPr>
+        <w:pStyle w:val="ListBullet"/>
+      </w:pPr>
+      <w:r>
+        <w:rPr>
+          <w:b/>
+        </w:rPr>
+        <w:t>Expected result:</w:t>
+      </w:r>
+      <w:r>
+        <w:t xml:space="preserve"> </w:t>
+      </w:r>
+      <w:r>
+        <w:rPr>
+          <w:rFonts w:ascii="Consolas" w:hAnsi="Consolas"/>
+          <w:sz w:val="20"/>
+        </w:rPr>
+        <w:t>201</w:t>
+      </w:r>
+      <w:r>
+        <w:t xml:space="preserve"> with </w:t>
+      </w:r>
+      <w:r>
+        <w:rPr>
+          <w:rFonts w:ascii="Consolas" w:hAnsi="Consolas"/>
+          <w:sz w:val="20"/>
+        </w:rPr>
+        <w:t>visa_id</w:t>
+      </w:r>
+      <w:r>
+        <w:t xml:space="preserve">, </w:t>
+      </w:r>
+      <w:r>
+        <w:rPr>
+          <w:rFonts w:ascii="Consolas" w:hAnsi="Consolas"/>
+          <w:sz w:val="20"/>
+        </w:rPr>
+        <w:t>row_version=1</w:t>
+      </w:r>
+      <w:r>
+        <w:t xml:space="preserve">; list </w:t>
+      </w:r>
+      <w:r>
+        <w:rPr>
+          <w:rFonts w:ascii="Consolas" w:hAnsi="Consolas"/>
+          <w:sz w:val="20"/>
+        </w:rPr>
+        <w:t>200</w:t>
+      </w:r>
+      <w:r>
+        <w:t xml:space="preserve"> returns the visa; distinct from statutory identity documents (separate resource/tag).</w:t>
+      </w:r>
+    </w:p>
+    <w:p>
+      <w:pPr>
+        <w:pStyle w:val="Heading4"/>
+      </w:pPr>
+      <w:r>
+        <w:rPr>
+          <w:b/>
+          <w:color w:val="2E5B9E"/>
+          <w:sz w:val="24"/>
+        </w:rPr>
+        <w:t>TC-G01-136</w:t>
+      </w:r>
+    </w:p>
+    <w:p>
+      <w:pPr>
+        <w:pStyle w:val="ListBullet"/>
+      </w:pPr>
+      <w:r>
+        <w:rPr>
+          <w:b/>
+        </w:rPr>
+        <w:t>Traces-to:</w:t>
+      </w:r>
+      <w:r>
+        <w:t xml:space="preserve"> FR-EPM-006 (v3.2 visa expiry); </w:t>
+      </w:r>
+      <w:r>
+        <w:rPr>
+          <w:rFonts w:ascii="Consolas" w:hAnsi="Consolas"/>
+          <w:sz w:val="20"/>
+        </w:rPr>
+        <w:t>GET /visas/expiring</w:t>
+      </w:r>
+      <w:r>
+        <w:t xml:space="preserve">; </w:t>
+      </w:r>
+      <w:r>
+        <w:rPr>
+          <w:rFonts w:ascii="Consolas" w:hAnsi="Consolas"/>
+          <w:sz w:val="20"/>
+        </w:rPr>
+        <w:t>ix_employee_visas_expiry</w:t>
+      </w:r>
+    </w:p>
+    <w:p>
+      <w:pPr>
+        <w:pStyle w:val="ListBullet"/>
+      </w:pPr>
+      <w:r>
+        <w:rPr>
+          <w:b/>
+        </w:rPr>
+        <w:t>Type:</w:t>
+      </w:r>
+      <w:r>
+        <w:t xml:space="preserve"> Functional · </w:t>
+      </w:r>
+      <w:r>
+        <w:rPr>
+          <w:b/>
+        </w:rPr>
+        <w:t>Priority:</w:t>
+      </w:r>
+      <w:r>
+        <w:t xml:space="preserve"> P3</w:t>
+      </w:r>
+    </w:p>
+    <w:p>
+      <w:pPr>
+        <w:pStyle w:val="ListBullet"/>
+      </w:pPr>
+      <w:r>
+        <w:rPr>
+          <w:b/>
+        </w:rPr>
+        <w:t>Title:</w:t>
+      </w:r>
+      <w:r>
+        <w:t xml:space="preserve"> Expiring-visa reminder report returns visas within the window</w:t>
+      </w:r>
+    </w:p>
+    <w:p>
+      <w:pPr>
+        <w:pStyle w:val="ListBullet"/>
+      </w:pPr>
+      <w:r>
+        <w:rPr>
+          <w:b/>
+        </w:rPr>
+        <w:t>Steps:</w:t>
+      </w:r>
+      <w:r>
+        <w:t xml:space="preserve"> 1. </w:t>
+      </w:r>
+      <w:r>
+        <w:rPr>
+          <w:rFonts w:ascii="Consolas" w:hAnsi="Consolas"/>
+          <w:sz w:val="20"/>
+        </w:rPr>
+        <w:t>GET /api/v1/visas/expiring?within_days=120&amp;limit=25</w:t>
+      </w:r>
+      <w:r>
+        <w:t>.</w:t>
+      </w:r>
+    </w:p>
+    <w:p>
+      <w:pPr>
+        <w:pStyle w:val="ListBullet"/>
+      </w:pPr>
+      <w:r>
+        <w:rPr>
+          <w:b/>
+        </w:rPr>
+        <w:t>Expected result:</w:t>
+      </w:r>
+      <w:r>
+        <w:t xml:space="preserve"> </w:t>
+      </w:r>
+      <w:r>
+        <w:rPr>
+          <w:rFonts w:ascii="Consolas" w:hAnsi="Consolas"/>
+          <w:sz w:val="20"/>
+        </w:rPr>
+        <w:t>200</w:t>
+      </w:r>
+      <w:r>
+        <w:t xml:space="preserve"> cursor page (</w:t>
+      </w:r>
+      <w:r>
+        <w:rPr>
+          <w:rFonts w:ascii="Consolas" w:hAnsi="Consolas"/>
+          <w:sz w:val="20"/>
+        </w:rPr>
+        <w:t>items</w:t>
+      </w:r>
+      <w:r>
+        <w:t xml:space="preserve"> + </w:t>
+      </w:r>
+      <w:r>
+        <w:rPr>
+          <w:rFonts w:ascii="Consolas" w:hAnsi="Consolas"/>
+          <w:sz w:val="20"/>
+        </w:rPr>
+        <w:t>next_cursor</w:t>
+      </w:r>
+      <w:r>
+        <w:t xml:space="preserve">) containing visas whose </w:t>
+      </w:r>
+      <w:r>
+        <w:rPr>
+          <w:rFonts w:ascii="Consolas" w:hAnsi="Consolas"/>
+          <w:sz w:val="20"/>
+        </w:rPr>
+        <w:t>valid_till</w:t>
+      </w:r>
+      <w:r>
+        <w:t xml:space="preserve"> falls within 120 days (e.g. the TEN-1 Schengen visa valid_till 2026-07-04); scope/masking per caller; </w:t>
+      </w:r>
+      <w:r>
+        <w:rPr>
+          <w:rFonts w:ascii="Consolas" w:hAnsi="Consolas"/>
+          <w:sz w:val="20"/>
+        </w:rPr>
+        <w:t>X-Correlation-Id</w:t>
+      </w:r>
+      <w:r>
+        <w:t xml:space="preserve"> present.</w:t>
+      </w:r>
+    </w:p>
+    <w:p>
+      <w:pPr>
+        <w:pStyle w:val="Heading4"/>
+      </w:pPr>
+      <w:r>
+        <w:rPr>
+          <w:b/>
+          <w:color w:val="2E5B9E"/>
+          <w:sz w:val="24"/>
+        </w:rPr>
+        <w:t>TC-G01-137</w:t>
+      </w:r>
+    </w:p>
+    <w:p>
+      <w:pPr>
+        <w:pStyle w:val="ListBullet"/>
+      </w:pPr>
+      <w:r>
+        <w:rPr>
+          <w:b/>
+        </w:rPr>
+        <w:t>Traces-to:</w:t>
+      </w:r>
+      <w:r>
+        <w:t xml:space="preserve"> FR-EPM-006 (v3.2); </w:t>
+      </w:r>
+      <w:r>
+        <w:rPr>
+          <w:rFonts w:ascii="Consolas" w:hAnsi="Consolas"/>
+          <w:sz w:val="20"/>
+        </w:rPr>
+        <w:t>ck_employee_visas_dates</w:t>
+      </w:r>
+      <w:r>
+        <w:t xml:space="preserve"> (valid_till ≥ issue_date); error-taxonomy VALIDATION_FAILED</w:t>
+      </w:r>
+    </w:p>
+    <w:p>
+      <w:pPr>
+        <w:pStyle w:val="ListBullet"/>
+      </w:pPr>
+      <w:r>
+        <w:rPr>
+          <w:b/>
+        </w:rPr>
+        <w:t>Type:</w:t>
+      </w:r>
+      <w:r>
+        <w:t xml:space="preserve"> Negative · </w:t>
+      </w:r>
+      <w:r>
+        <w:rPr>
+          <w:b/>
+        </w:rPr>
+        <w:t>Priority:</w:t>
+      </w:r>
+      <w:r>
+        <w:t xml:space="preserve"> P2</w:t>
+      </w:r>
+    </w:p>
+    <w:p>
+      <w:pPr>
+        <w:pStyle w:val="ListBullet"/>
+      </w:pPr>
+      <w:r>
+        <w:rPr>
+          <w:b/>
+        </w:rPr>
+        <w:t>Title:</w:t>
+      </w:r>
+      <w:r>
+        <w:t xml:space="preserve"> Visa with </w:t>
+      </w:r>
+      <w:r>
+        <w:rPr>
+          <w:rFonts w:ascii="Consolas" w:hAnsi="Consolas"/>
+          <w:sz w:val="20"/>
+        </w:rPr>
+        <w:t>valid_till</w:t>
+      </w:r>
+      <w:r>
+        <w:t xml:space="preserve"> before </w:t>
+      </w:r>
+      <w:r>
+        <w:rPr>
+          <w:rFonts w:ascii="Consolas" w:hAnsi="Consolas"/>
+          <w:sz w:val="20"/>
+        </w:rPr>
+        <w:t>issue_date</w:t>
+      </w:r>
+      <w:r>
+        <w:t xml:space="preserve"> is rejected</w:t>
+      </w:r>
+    </w:p>
+    <w:p>
+      <w:pPr>
+        <w:pStyle w:val="ListBullet"/>
+      </w:pPr>
+      <w:r>
+        <w:rPr>
+          <w:b/>
+        </w:rPr>
+        <w:t>Steps:</w:t>
+      </w:r>
+      <w:r>
+        <w:t xml:space="preserve"> 1. </w:t>
+      </w:r>
+      <w:r>
+        <w:rPr>
+          <w:rFonts w:ascii="Consolas" w:hAnsi="Consolas"/>
+          <w:sz w:val="20"/>
+        </w:rPr>
+        <w:t>POST /api/v1/employees/{EMP-1001}/visas</w:t>
+      </w:r>
+      <w:r>
+        <w:t xml:space="preserve"> {country:"UAE", visa_type:"Employment", issue_date:"2026-06-01", valid_till:"2026-01-01"}.</w:t>
+      </w:r>
+    </w:p>
+    <w:p>
+      <w:pPr>
+        <w:pStyle w:val="ListBullet"/>
+      </w:pPr>
+      <w:r>
+        <w:rPr>
+          <w:b/>
+        </w:rPr>
+        <w:t>Expected result:</w:t>
+      </w:r>
+      <w:r>
+        <w:t xml:space="preserve"> </w:t>
+      </w:r>
+      <w:r>
+        <w:rPr>
+          <w:rFonts w:ascii="Consolas" w:hAnsi="Consolas"/>
+          <w:sz w:val="20"/>
+        </w:rPr>
+        <w:t>422 VALIDATION_FAILED</w:t>
+      </w:r>
+      <w:r>
+        <w:t xml:space="preserve">; </w:t>
+      </w:r>
+      <w:r>
+        <w:rPr>
+          <w:rFonts w:ascii="Consolas" w:hAnsi="Consolas"/>
+          <w:sz w:val="20"/>
+        </w:rPr>
+        <w:t>field="valid_till"</w:t>
+      </w:r>
+      <w:r>
+        <w:t>; nothing persisted.</w:t>
+      </w:r>
+    </w:p>
+    <w:p>
+      <w:pPr>
+        <w:pStyle w:val="Heading4"/>
+      </w:pPr>
+      <w:r>
+        <w:rPr>
+          <w:b/>
+          <w:color w:val="2E5B9E"/>
+          <w:sz w:val="24"/>
+        </w:rPr>
+        <w:t>TC-G01-138</w:t>
+      </w:r>
+    </w:p>
+    <w:p>
+      <w:pPr>
+        <w:pStyle w:val="ListBullet"/>
+      </w:pPr>
+      <w:r>
+        <w:rPr>
+          <w:b/>
+        </w:rPr>
+        <w:t>Traces-to:</w:t>
+      </w:r>
+      <w:r>
+        <w:t xml:space="preserve"> FR-EPM-006 (v3.2 F5, </w:t>
+      </w:r>
+      <w:r>
+        <w:rPr>
+          <w:rFonts w:ascii="Consolas" w:hAnsi="Consolas"/>
+          <w:sz w:val="20"/>
+        </w:rPr>
+        <w:t>employee_professional_certifications</w:t>
+      </w:r>
+      <w:r>
+        <w:t xml:space="preserve">); </w:t>
+      </w:r>
+      <w:r>
+        <w:rPr>
+          <w:rFonts w:ascii="Consolas" w:hAnsi="Consolas"/>
+          <w:sz w:val="20"/>
+        </w:rPr>
+        <w:t>POST</w:t>
+      </w:r>
+      <w:r>
+        <w:t>/</w:t>
+      </w:r>
+      <w:r>
+        <w:rPr>
+          <w:rFonts w:ascii="Consolas" w:hAnsi="Consolas"/>
+          <w:sz w:val="20"/>
+        </w:rPr>
+        <w:t>GET /employees/{id}/professional-certifications</w:t>
+      </w:r>
+    </w:p>
+    <w:p>
+      <w:pPr>
+        <w:pStyle w:val="ListBullet"/>
+      </w:pPr>
+      <w:r>
+        <w:rPr>
+          <w:b/>
+        </w:rPr>
+        <w:t>Type:</w:t>
+      </w:r>
+      <w:r>
+        <w:t xml:space="preserve"> Functional · </w:t>
+      </w:r>
+      <w:r>
+        <w:rPr>
+          <w:b/>
+        </w:rPr>
+        <w:t>Priority:</w:t>
+      </w:r>
+      <w:r>
+        <w:t xml:space="preserve"> P2</w:t>
+      </w:r>
+    </w:p>
+    <w:p>
+      <w:pPr>
+        <w:pStyle w:val="ListBullet"/>
+      </w:pPr>
+      <w:r>
+        <w:rPr>
+          <w:b/>
+        </w:rPr>
+        <w:t>Title:</w:t>
+      </w:r>
+      <w:r>
+        <w:t xml:space="preserve"> Add and list a professional certification (distinct from statutory certificates)</w:t>
+      </w:r>
+    </w:p>
+    <w:p>
+      <w:pPr>
+        <w:pStyle w:val="ListBullet"/>
+      </w:pPr>
+      <w:r>
+        <w:rPr>
+          <w:b/>
+        </w:rPr>
+        <w:t>Steps:</w:t>
+      </w:r>
+      <w:r>
+        <w:t xml:space="preserve"> 1. </w:t>
+      </w:r>
+      <w:r>
+        <w:rPr>
+          <w:rFonts w:ascii="Consolas" w:hAnsi="Consolas"/>
+          <w:sz w:val="20"/>
+        </w:rPr>
+        <w:t>POST /api/v1/employees/{EMP-1001}/professional-certifications</w:t>
+      </w:r>
+      <w:r>
+        <w:t xml:space="preserve"> {certification_name:"AWS Solutions Architect – Associate", issuing_organisation:"Amazon Web Services", credential_id:"AWS-ASA-88213", issue_date:"2024-09-01", expiry_date:"2027-09-01"} + Idempotency-Key. 2. </w:t>
+      </w:r>
+      <w:r>
+        <w:rPr>
+          <w:rFonts w:ascii="Consolas" w:hAnsi="Consolas"/>
+          <w:sz w:val="20"/>
+        </w:rPr>
+        <w:t>GET …/professional-certifications</w:t>
+      </w:r>
+      <w:r>
+        <w:t>.</w:t>
+      </w:r>
+    </w:p>
+    <w:p>
+      <w:pPr>
+        <w:pStyle w:val="ListBullet"/>
+      </w:pPr>
+      <w:r>
+        <w:rPr>
+          <w:b/>
+        </w:rPr>
+        <w:t>Expected result:</w:t>
+      </w:r>
+      <w:r>
+        <w:t xml:space="preserve"> </w:t>
+      </w:r>
+      <w:r>
+        <w:rPr>
+          <w:rFonts w:ascii="Consolas" w:hAnsi="Consolas"/>
+          <w:sz w:val="20"/>
+        </w:rPr>
+        <w:t>201</w:t>
+      </w:r>
+      <w:r>
+        <w:t xml:space="preserve"> with </w:t>
+      </w:r>
+      <w:r>
+        <w:rPr>
+          <w:rFonts w:ascii="Consolas" w:hAnsi="Consolas"/>
+          <w:sz w:val="20"/>
+        </w:rPr>
+        <w:t>certification_id</w:t>
+      </w:r>
+      <w:r>
+        <w:t xml:space="preserve">; list </w:t>
+      </w:r>
+      <w:r>
+        <w:rPr>
+          <w:rFonts w:ascii="Consolas" w:hAnsi="Consolas"/>
+          <w:sz w:val="20"/>
+        </w:rPr>
+        <w:t>200</w:t>
+      </w:r>
+      <w:r>
+        <w:t xml:space="preserve"> returns it; kept separate from FR-EPM-023 statutory </w:t>
+      </w:r>
+      <w:r>
+        <w:rPr>
+          <w:rFonts w:ascii="Consolas" w:hAnsi="Consolas"/>
+          <w:sz w:val="20"/>
+        </w:rPr>
+        <w:t>employee_certificates</w:t>
+      </w:r>
+      <w:r>
+        <w:t>.</w:t>
+      </w:r>
+    </w:p>
+    <w:p>
+      <w:pPr>
+        <w:pStyle w:val="Heading4"/>
+      </w:pPr>
+      <w:r>
+        <w:rPr>
+          <w:b/>
+          <w:color w:val="2E5B9E"/>
+          <w:sz w:val="24"/>
+        </w:rPr>
+        <w:t>TC-G01-139</w:t>
+      </w:r>
+    </w:p>
+    <w:p>
+      <w:pPr>
+        <w:pStyle w:val="ListBullet"/>
+      </w:pPr>
+      <w:r>
+        <w:rPr>
+          <w:b/>
+        </w:rPr>
+        <w:t>Traces-to:</w:t>
+      </w:r>
+      <w:r>
+        <w:t xml:space="preserve"> FR-EPM-006 (v3.2); </w:t>
+      </w:r>
+      <w:r>
+        <w:rPr>
+          <w:rFonts w:ascii="Consolas" w:hAnsi="Consolas"/>
+          <w:sz w:val="20"/>
+        </w:rPr>
+        <w:t>ck_prof_cert_dates</w:t>
+      </w:r>
+      <w:r>
+        <w:t xml:space="preserve"> (expiry_date ≥ issue_date); error-taxonomy VALIDATION_FAILED</w:t>
+      </w:r>
+    </w:p>
+    <w:p>
+      <w:pPr>
+        <w:pStyle w:val="ListBullet"/>
+      </w:pPr>
+      <w:r>
+        <w:rPr>
+          <w:b/>
+        </w:rPr>
+        <w:t>Type:</w:t>
+      </w:r>
+      <w:r>
+        <w:t xml:space="preserve"> Negative · </w:t>
+      </w:r>
+      <w:r>
+        <w:rPr>
+          <w:b/>
+        </w:rPr>
+        <w:t>Priority:</w:t>
+      </w:r>
+      <w:r>
+        <w:t xml:space="preserve"> P2</w:t>
+      </w:r>
+    </w:p>
+    <w:p>
+      <w:pPr>
+        <w:pStyle w:val="ListBullet"/>
+      </w:pPr>
+      <w:r>
+        <w:rPr>
+          <w:b/>
+        </w:rPr>
+        <w:t>Title:</w:t>
+      </w:r>
+      <w:r>
+        <w:t xml:space="preserve"> Professional certification with </w:t>
+      </w:r>
+      <w:r>
+        <w:rPr>
+          <w:rFonts w:ascii="Consolas" w:hAnsi="Consolas"/>
+          <w:sz w:val="20"/>
+        </w:rPr>
+        <w:t>expiry_date</w:t>
+      </w:r>
+      <w:r>
+        <w:t xml:space="preserve"> before </w:t>
+      </w:r>
+      <w:r>
+        <w:rPr>
+          <w:rFonts w:ascii="Consolas" w:hAnsi="Consolas"/>
+          <w:sz w:val="20"/>
+        </w:rPr>
+        <w:t>issue_date</w:t>
+      </w:r>
+      <w:r>
+        <w:t xml:space="preserve"> is rejected</w:t>
+      </w:r>
+    </w:p>
+    <w:p>
+      <w:pPr>
+        <w:pStyle w:val="ListBullet"/>
+      </w:pPr>
+      <w:r>
+        <w:rPr>
+          <w:b/>
+        </w:rPr>
+        <w:t>Steps:</w:t>
+      </w:r>
+      <w:r>
+        <w:t xml:space="preserve"> 1. </w:t>
+      </w:r>
+      <w:r>
+        <w:rPr>
+          <w:rFonts w:ascii="Consolas" w:hAnsi="Consolas"/>
+          <w:sz w:val="20"/>
+        </w:rPr>
+        <w:t>POST …/professional-certifications</w:t>
+      </w:r>
+      <w:r>
+        <w:t xml:space="preserve"> {certification_name:"X", issue_date:"2025-01-01", expiry_date:"2024-01-01"}.</w:t>
+      </w:r>
+    </w:p>
+    <w:p>
+      <w:pPr>
+        <w:pStyle w:val="ListBullet"/>
+      </w:pPr>
+      <w:r>
+        <w:rPr>
+          <w:b/>
+        </w:rPr>
+        <w:t>Expected result:</w:t>
+      </w:r>
+      <w:r>
+        <w:t xml:space="preserve"> </w:t>
+      </w:r>
+      <w:r>
+        <w:rPr>
+          <w:rFonts w:ascii="Consolas" w:hAnsi="Consolas"/>
+          <w:sz w:val="20"/>
+        </w:rPr>
+        <w:t>422 VALIDATION_FAILED</w:t>
+      </w:r>
+      <w:r>
+        <w:t xml:space="preserve">; </w:t>
+      </w:r>
+      <w:r>
+        <w:rPr>
+          <w:rFonts w:ascii="Consolas" w:hAnsi="Consolas"/>
+          <w:sz w:val="20"/>
+        </w:rPr>
+        <w:t>field="expiry_date"</w:t>
+      </w:r>
+      <w:r>
+        <w:t>; nothing persisted.</w:t>
+      </w:r>
+    </w:p>
+    <w:p>
+      <w:pPr>
+        <w:pStyle w:val="Heading4"/>
+      </w:pPr>
+      <w:r>
+        <w:rPr>
+          <w:b/>
+          <w:color w:val="2E5B9E"/>
+          <w:sz w:val="24"/>
+        </w:rPr>
+        <w:t>TC-G01-140</w:t>
+      </w:r>
+    </w:p>
+    <w:p>
+      <w:pPr>
+        <w:pStyle w:val="ListBullet"/>
+      </w:pPr>
+      <w:r>
+        <w:rPr>
+          <w:b/>
+        </w:rPr>
+        <w:t>Traces-to:</w:t>
+      </w:r>
+      <w:r>
+        <w:t xml:space="preserve"> FR-EPM-006 (v3.2 F3, </w:t>
+      </w:r>
+      <w:r>
+        <w:rPr>
+          <w:rFonts w:ascii="Consolas" w:hAnsi="Consolas"/>
+          <w:sz w:val="20"/>
+        </w:rPr>
+        <w:t>employee_profile_skills</w:t>
+      </w:r>
+      <w:r>
+        <w:t xml:space="preserve">); </w:t>
+      </w:r>
+      <w:r>
+        <w:rPr>
+          <w:rFonts w:ascii="Consolas" w:hAnsi="Consolas"/>
+          <w:sz w:val="20"/>
+        </w:rPr>
+        <w:t>POST</w:t>
+      </w:r>
+      <w:r>
+        <w:t>/</w:t>
+      </w:r>
+      <w:r>
+        <w:rPr>
+          <w:rFonts w:ascii="Consolas" w:hAnsi="Consolas"/>
+          <w:sz w:val="20"/>
+        </w:rPr>
+        <w:t>GET /employees/{id}/skills</w:t>
+      </w:r>
+    </w:p>
+    <w:p>
+      <w:pPr>
+        <w:pStyle w:val="ListBullet"/>
+      </w:pPr>
+      <w:r>
+        <w:rPr>
+          <w:b/>
+        </w:rPr>
+        <w:t>Type:</w:t>
+      </w:r>
+      <w:r>
+        <w:t xml:space="preserve"> Functional · </w:t>
+      </w:r>
+      <w:r>
+        <w:rPr>
+          <w:b/>
+        </w:rPr>
+        <w:t>Priority:</w:t>
+      </w:r>
+      <w:r>
+        <w:t xml:space="preserve"> P3</w:t>
+      </w:r>
+    </w:p>
+    <w:p>
+      <w:pPr>
+        <w:pStyle w:val="ListBullet"/>
+      </w:pPr>
+      <w:r>
+        <w:rPr>
+          <w:b/>
+        </w:rPr>
+        <w:t>Title:</w:t>
+      </w:r>
+      <w:r>
+        <w:t xml:space="preserve"> Add and list a declared profile skill</w:t>
+      </w:r>
+    </w:p>
+    <w:p>
+      <w:pPr>
+        <w:pStyle w:val="ListBullet"/>
+      </w:pPr>
+      <w:r>
+        <w:rPr>
+          <w:b/>
+        </w:rPr>
+        <w:t>Steps:</w:t>
+      </w:r>
+      <w:r>
+        <w:t xml:space="preserve"> 1. </w:t>
+      </w:r>
+      <w:r>
+        <w:rPr>
+          <w:rFonts w:ascii="Consolas" w:hAnsi="Consolas"/>
+          <w:sz w:val="20"/>
+        </w:rPr>
+        <w:t>POST /api/v1/employees/{EMP-1001}/skills</w:t>
+      </w:r>
+      <w:r>
+        <w:t xml:space="preserve"> {skill_name:"Python", proficiency:"ADVANCED", years_of_experience:8.0, last_used_date:"2026-06-01"} + Idempotency-Key. 2. </w:t>
+      </w:r>
+      <w:r>
+        <w:rPr>
+          <w:rFonts w:ascii="Consolas" w:hAnsi="Consolas"/>
+          <w:sz w:val="20"/>
+        </w:rPr>
+        <w:t>GET …/skills</w:t>
+      </w:r>
+      <w:r>
+        <w:t>.</w:t>
+      </w:r>
+    </w:p>
+    <w:p>
+      <w:pPr>
+        <w:pStyle w:val="ListBullet"/>
+      </w:pPr>
+      <w:r>
+        <w:rPr>
+          <w:b/>
+        </w:rPr>
+        <w:t>Expected result:</w:t>
+      </w:r>
+      <w:r>
+        <w:t xml:space="preserve"> </w:t>
+      </w:r>
+      <w:r>
+        <w:rPr>
+          <w:rFonts w:ascii="Consolas" w:hAnsi="Consolas"/>
+          <w:sz w:val="20"/>
+        </w:rPr>
+        <w:t>201</w:t>
+      </w:r>
+      <w:r>
+        <w:t xml:space="preserve"> with </w:t>
+      </w:r>
+      <w:r>
+        <w:rPr>
+          <w:rFonts w:ascii="Consolas" w:hAnsi="Consolas"/>
+          <w:sz w:val="20"/>
+        </w:rPr>
+        <w:t>skill_id</w:t>
+      </w:r>
+      <w:r>
+        <w:t xml:space="preserve">; list </w:t>
+      </w:r>
+      <w:r>
+        <w:rPr>
+          <w:rFonts w:ascii="Consolas" w:hAnsi="Consolas"/>
+          <w:sz w:val="20"/>
+        </w:rPr>
+        <w:t>200</w:t>
+      </w:r>
+      <w:r>
+        <w:t xml:space="preserve"> returns the skill; </w:t>
+      </w:r>
+      <w:r>
+        <w:rPr>
+          <w:rFonts w:ascii="Consolas" w:hAnsi="Consolas"/>
+          <w:sz w:val="20"/>
+        </w:rPr>
+        <w:t>proficiency</w:t>
+      </w:r>
+      <w:r>
+        <w:t xml:space="preserve"> constrained to the SKILL_PROFICIENCY set.</w:t>
+      </w:r>
+    </w:p>
+    <w:p>
+      <w:pPr>
+        <w:pStyle w:val="Heading4"/>
+      </w:pPr>
+      <w:r>
+        <w:rPr>
+          <w:b/>
+          <w:color w:val="2E5B9E"/>
+          <w:sz w:val="24"/>
+        </w:rPr>
+        <w:t>TC-G01-141</w:t>
+      </w:r>
+    </w:p>
+    <w:p>
+      <w:pPr>
+        <w:pStyle w:val="ListBullet"/>
+      </w:pPr>
+      <w:r>
+        <w:rPr>
+          <w:b/>
+        </w:rPr>
+        <w:t>Traces-to:</w:t>
+      </w:r>
+      <w:r>
+        <w:t xml:space="preserve"> FR-EPM-006 (v3.2); </w:t>
+      </w:r>
+      <w:r>
+        <w:rPr>
+          <w:rFonts w:ascii="Consolas" w:hAnsi="Consolas"/>
+          <w:sz w:val="20"/>
+        </w:rPr>
+        <w:t>uq_employee_skills_name</w:t>
+      </w:r>
+      <w:r>
+        <w:t xml:space="preserve"> (one non-deleted row per employee+skill); error-taxonomy CONFLICT</w:t>
+      </w:r>
+    </w:p>
+    <w:p>
+      <w:pPr>
+        <w:pStyle w:val="ListBullet"/>
+      </w:pPr>
+      <w:r>
+        <w:rPr>
+          <w:b/>
+        </w:rPr>
+        <w:t>Type:</w:t>
+      </w:r>
+      <w:r>
+        <w:t xml:space="preserve"> Negative · </w:t>
+      </w:r>
+      <w:r>
+        <w:rPr>
+          <w:b/>
+        </w:rPr>
+        <w:t>Priority:</w:t>
+      </w:r>
+      <w:r>
+        <w:t xml:space="preserve"> P2</w:t>
+      </w:r>
+    </w:p>
+    <w:p>
+      <w:pPr>
+        <w:pStyle w:val="ListBullet"/>
+      </w:pPr>
+      <w:r>
+        <w:rPr>
+          <w:b/>
+        </w:rPr>
+        <w:t>Title:</w:t>
+      </w:r>
+      <w:r>
+        <w:t xml:space="preserve"> Duplicate skill name for the same employee is rejected</w:t>
+      </w:r>
+    </w:p>
+    <w:p>
+      <w:pPr>
+        <w:pStyle w:val="ListBullet"/>
+      </w:pPr>
+      <w:r>
+        <w:rPr>
+          <w:b/>
+        </w:rPr>
+        <w:t>Steps:</w:t>
+      </w:r>
+      <w:r>
+        <w:t xml:space="preserve"> 1. </w:t>
+      </w:r>
+      <w:r>
+        <w:rPr>
+          <w:rFonts w:ascii="Consolas" w:hAnsi="Consolas"/>
+          <w:sz w:val="20"/>
+        </w:rPr>
+        <w:t>POST /api/v1/employees/{EMP-1001}/skills</w:t>
+      </w:r>
+      <w:r>
+        <w:t xml:space="preserve"> {skill_name:"python"} (case-insensitive duplicate of TC-140).</w:t>
+      </w:r>
+    </w:p>
+    <w:p>
+      <w:pPr>
+        <w:pStyle w:val="ListBullet"/>
+      </w:pPr>
+      <w:r>
+        <w:rPr>
+          <w:b/>
+        </w:rPr>
+        <w:t>Expected result:</w:t>
+      </w:r>
+      <w:r>
+        <w:t xml:space="preserve"> </w:t>
+      </w:r>
+      <w:r>
+        <w:rPr>
+          <w:rFonts w:ascii="Consolas" w:hAnsi="Consolas"/>
+          <w:sz w:val="20"/>
+        </w:rPr>
+        <w:t>409 CONFLICT</w:t>
+      </w:r>
+      <w:r>
+        <w:t xml:space="preserve">; canonical envelope; no second row; </w:t>
+      </w:r>
+      <w:r>
+        <w:rPr>
+          <w:rFonts w:ascii="Consolas" w:hAnsi="Consolas"/>
+          <w:sz w:val="20"/>
+        </w:rPr>
+        <w:t>X-Correlation-Id</w:t>
+      </w:r>
+      <w:r>
+        <w:t xml:space="preserve"> present.</w:t>
+      </w:r>
+    </w:p>
+    <w:p>
+      <w:pPr>
+        <w:pStyle w:val="Heading4"/>
+      </w:pPr>
+      <w:r>
+        <w:rPr>
+          <w:b/>
+          <w:color w:val="2E5B9E"/>
+          <w:sz w:val="24"/>
+        </w:rPr>
+        <w:t>TC-G01-142</w:t>
+      </w:r>
+    </w:p>
+    <w:p>
+      <w:pPr>
+        <w:pStyle w:val="ListBullet"/>
+      </w:pPr>
+      <w:r>
+        <w:rPr>
+          <w:b/>
+        </w:rPr>
+        <w:t>Traces-to:</w:t>
+      </w:r>
+      <w:r>
+        <w:t xml:space="preserve"> FR-EPM-008 (v3.2 F11, </w:t>
+      </w:r>
+      <w:r>
+        <w:rPr>
+          <w:rFonts w:ascii="Consolas" w:hAnsi="Consolas"/>
+          <w:sz w:val="20"/>
+        </w:rPr>
+        <w:t>employee_bank_accounts.penny_drop_status</w:t>
+      </w:r>
+      <w:r>
+        <w:t xml:space="preserve">); </w:t>
+      </w:r>
+      <w:r>
+        <w:rPr>
+          <w:rFonts w:ascii="Consolas" w:hAnsi="Consolas"/>
+          <w:sz w:val="20"/>
+        </w:rPr>
+        <w:t>POST /bank-accounts/{id}:verify</w:t>
+      </w:r>
+      <w:r>
+        <w:t>; PENNY_DROP_STATUS enum</w:t>
+      </w:r>
+    </w:p>
+    <w:p>
+      <w:pPr>
+        <w:pStyle w:val="ListBullet"/>
+      </w:pPr>
+      <w:r>
+        <w:rPr>
+          <w:b/>
+        </w:rPr>
+        <w:t>Type:</w:t>
+      </w:r>
+      <w:r>
+        <w:t xml:space="preserve"> State-Transition · </w:t>
+      </w:r>
+      <w:r>
+        <w:rPr>
+          <w:b/>
+        </w:rPr>
+        <w:t>Priority:</w:t>
+      </w:r>
+      <w:r>
+        <w:t xml:space="preserve"> P2</w:t>
+      </w:r>
+    </w:p>
+    <w:p>
+      <w:pPr>
+        <w:pStyle w:val="ListBullet"/>
+      </w:pPr>
+      <w:r>
+        <w:rPr>
+          <w:b/>
+        </w:rPr>
+        <w:t>Title:</w:t>
+      </w:r>
+      <w:r>
+        <w:t xml:space="preserve"> Penny-drop verification sets </w:t>
+      </w:r>
+      <w:r>
+        <w:rPr>
+          <w:rFonts w:ascii="Consolas" w:hAnsi="Consolas"/>
+          <w:sz w:val="20"/>
+        </w:rPr>
+        <w:t>penny_drop_status = VERIFIED</w:t>
+      </w:r>
+    </w:p>
+    <w:p>
+      <w:pPr>
+        <w:pStyle w:val="ListBullet"/>
+      </w:pPr>
+      <w:r>
+        <w:rPr>
+          <w:b/>
+        </w:rPr>
+        <w:t>Steps:</w:t>
+      </w:r>
+      <w:r>
+        <w:t xml:space="preserve"> 1. Add a bank account (TC-046 pattern), approved via 4-eyes. 2. </w:t>
+      </w:r>
+      <w:r>
+        <w:rPr>
+          <w:rFonts w:ascii="Consolas" w:hAnsi="Consolas"/>
+          <w:sz w:val="20"/>
+        </w:rPr>
+        <w:t>POST /api/v1/bank-accounts/{bank_account_id}:verify</w:t>
+      </w:r>
+      <w:r>
+        <w:t xml:space="preserve"> + Idempotency-Key.</w:t>
+      </w:r>
+    </w:p>
+    <w:p>
+      <w:pPr>
+        <w:pStyle w:val="ListBullet"/>
+      </w:pPr>
+      <w:r>
+        <w:rPr>
+          <w:b/>
+        </w:rPr>
+        <w:t>Expected result:</w:t>
+      </w:r>
+      <w:r>
+        <w:t xml:space="preserve"> </w:t>
+      </w:r>
+      <w:r>
+        <w:rPr>
+          <w:rFonts w:ascii="Consolas" w:hAnsi="Consolas"/>
+          <w:sz w:val="20"/>
+        </w:rPr>
+        <w:t>200</w:t>
+      </w:r>
+      <w:r>
+        <w:t xml:space="preserve">; response </w:t>
+      </w:r>
+      <w:r>
+        <w:rPr>
+          <w:rFonts w:ascii="Consolas" w:hAnsi="Consolas"/>
+          <w:sz w:val="20"/>
+        </w:rPr>
+        <w:t>penny_drop_status="VERIFIED"</w:t>
+      </w:r>
+      <w:r>
+        <w:t xml:space="preserve"> and </w:t>
+      </w:r>
+      <w:r>
+        <w:rPr>
+          <w:rFonts w:ascii="Consolas" w:hAnsi="Consolas"/>
+          <w:sz w:val="20"/>
+        </w:rPr>
+        <w:t>is_verified=true</w:t>
+      </w:r>
+      <w:r>
+        <w:t>; state moves PENDING→VERIFIED; audited.</w:t>
+      </w:r>
+    </w:p>
+    <w:p>
+      <w:pPr>
+        <w:pStyle w:val="Heading4"/>
+      </w:pPr>
+      <w:r>
+        <w:rPr>
+          <w:b/>
+          <w:color w:val="2E5B9E"/>
+          <w:sz w:val="24"/>
+        </w:rPr>
+        <w:t>TC-G01-143</w:t>
+      </w:r>
+    </w:p>
+    <w:p>
+      <w:pPr>
+        <w:pStyle w:val="ListBullet"/>
+      </w:pPr>
+      <w:r>
+        <w:rPr>
+          <w:b/>
+        </w:rPr>
+        <w:t>Traces-to:</w:t>
+      </w:r>
+      <w:r>
+        <w:t xml:space="preserve"> FR-EPM-008 (v3.2); tri-state PENNY_DROP_STATUS (PENDING/VERIFIED/FAILED); FR-EPM-014 never-blocks-payroll regression</w:t>
+      </w:r>
+    </w:p>
+    <w:p>
+      <w:pPr>
+        <w:pStyle w:val="ListBullet"/>
+      </w:pPr>
+      <w:r>
+        <w:rPr>
+          <w:b/>
+        </w:rPr>
+        <w:t>Type:</w:t>
+      </w:r>
+      <w:r>
+        <w:t xml:space="preserve"> State-Transition · </w:t>
+      </w:r>
+      <w:r>
+        <w:rPr>
+          <w:b/>
+        </w:rPr>
+        <w:t>Priority:</w:t>
+      </w:r>
+      <w:r>
+        <w:t xml:space="preserve"> P2</w:t>
+      </w:r>
+    </w:p>
+    <w:p>
+      <w:pPr>
+        <w:pStyle w:val="ListBullet"/>
+      </w:pPr>
+      <w:r>
+        <w:rPr>
+          <w:b/>
+        </w:rPr>
+        <w:t>Title:</w:t>
+      </w:r>
+      <w:r>
+        <w:t xml:space="preserve"> Failed penny-drop yields </w:t>
+      </w:r>
+      <w:r>
+        <w:rPr>
+          <w:rFonts w:ascii="Consolas" w:hAnsi="Consolas"/>
+          <w:sz w:val="20"/>
+        </w:rPr>
+        <w:t>penny_drop_status = FAILED</w:t>
+      </w:r>
+      <w:r>
+        <w:t xml:space="preserve"> (tri-state), not a silent verify</w:t>
+      </w:r>
+    </w:p>
+    <w:p>
+      <w:pPr>
+        <w:pStyle w:val="ListBullet"/>
+      </w:pPr>
+      <w:r>
+        <w:rPr>
+          <w:b/>
+        </w:rPr>
+        <w:t>Steps:</w:t>
+      </w:r>
+      <w:r>
+        <w:t xml:space="preserve"> 1. </w:t>
+      </w:r>
+      <w:r>
+        <w:rPr>
+          <w:rFonts w:ascii="Consolas" w:hAnsi="Consolas"/>
+          <w:sz w:val="20"/>
+        </w:rPr>
+        <w:t>POST /api/v1/bank-accounts/{bank_account_id}:verify</w:t>
+      </w:r>
+      <w:r>
+        <w:t xml:space="preserve"> where the drop is returned/failed by the provider.</w:t>
+      </w:r>
+    </w:p>
+    <w:p>
+      <w:pPr>
+        <w:pStyle w:val="ListBullet"/>
+      </w:pPr>
+      <w:r>
+        <w:rPr>
+          <w:b/>
+        </w:rPr>
+        <w:t>Expected result:</w:t>
+      </w:r>
+      <w:r>
+        <w:t xml:space="preserve"> </w:t>
+      </w:r>
+      <w:r>
+        <w:rPr>
+          <w:rFonts w:ascii="Consolas" w:hAnsi="Consolas"/>
+          <w:sz w:val="20"/>
+        </w:rPr>
+        <w:t>200</w:t>
+      </w:r>
+      <w:r>
+        <w:t xml:space="preserve">; </w:t>
+      </w:r>
+      <w:r>
+        <w:rPr>
+          <w:rFonts w:ascii="Consolas" w:hAnsi="Consolas"/>
+          <w:sz w:val="20"/>
+        </w:rPr>
+        <w:t>penny_drop_status="FAILED"</w:t>
+      </w:r>
+      <w:r>
+        <w:t xml:space="preserve">, </w:t>
+      </w:r>
+      <w:r>
+        <w:rPr>
+          <w:rFonts w:ascii="Consolas" w:hAnsi="Consolas"/>
+          <w:sz w:val="20"/>
+        </w:rPr>
+        <w:t>is_verified=false</w:t>
+      </w:r>
+      <w:r>
+        <w:t xml:space="preserve"> (FAILED is representable, which </w:t>
+      </w:r>
+      <w:r>
+        <w:rPr>
+          <w:rFonts w:ascii="Consolas" w:hAnsi="Consolas"/>
+          <w:sz w:val="20"/>
+        </w:rPr>
+        <w:t>is_verified</w:t>
+      </w:r>
+      <w:r>
+        <w:t xml:space="preserve"> alone could not express); disbursement gating still surfaces </w:t>
+      </w:r>
+      <w:r>
+        <w:rPr>
+          <w:rFonts w:ascii="Consolas" w:hAnsi="Consolas"/>
+          <w:sz w:val="20"/>
+        </w:rPr>
+        <w:t>NO_VERIFIED_BANK</w:t>
+      </w:r>
+      <w:r>
+        <w:t xml:space="preserve"> downstream (G10); profile completeness/payroll not hard-blocked.</w:t>
+      </w:r>
+    </w:p>
+    <w:p>
+      <w:pPr>
+        <w:pStyle w:val="Heading4"/>
+      </w:pPr>
+      <w:r>
+        <w:rPr>
+          <w:b/>
+          <w:color w:val="2E5B9E"/>
+          <w:sz w:val="24"/>
+        </w:rPr>
+        <w:t>TC-G01-144</w:t>
+      </w:r>
+    </w:p>
+    <w:p>
+      <w:pPr>
+        <w:pStyle w:val="ListBullet"/>
+      </w:pPr>
+      <w:r>
+        <w:rPr>
+          <w:b/>
+        </w:rPr>
+        <w:t>Traces-to:</w:t>
+      </w:r>
+      <w:r>
+        <w:t xml:space="preserve"> FR-EPM-001 (v3.2 F2, </w:t>
+      </w:r>
+      <w:r>
+        <w:rPr>
+          <w:rFonts w:ascii="Consolas" w:hAnsi="Consolas"/>
+          <w:sz w:val="20"/>
+        </w:rPr>
+        <w:t>employee_personal_details</w:t>
+      </w:r>
+      <w:r>
+        <w:t xml:space="preserve">, 1:1); </w:t>
+      </w:r>
+      <w:r>
+        <w:rPr>
+          <w:rFonts w:ascii="Consolas" w:hAnsi="Consolas"/>
+          <w:sz w:val="20"/>
+        </w:rPr>
+        <w:t>GET</w:t>
+      </w:r>
+      <w:r>
+        <w:t>/</w:t>
+      </w:r>
+      <w:r>
+        <w:rPr>
+          <w:rFonts w:ascii="Consolas" w:hAnsi="Consolas"/>
+          <w:sz w:val="20"/>
+        </w:rPr>
+        <w:t>PUT /employees/{id}/personal-details</w:t>
+      </w:r>
+    </w:p>
+    <w:p>
+      <w:pPr>
+        <w:pStyle w:val="ListBullet"/>
+      </w:pPr>
+      <w:r>
+        <w:rPr>
+          <w:b/>
+        </w:rPr>
+        <w:t>Type:</w:t>
+      </w:r>
+      <w:r>
+        <w:t xml:space="preserve"> Functional · </w:t>
+      </w:r>
+      <w:r>
+        <w:rPr>
+          <w:b/>
+        </w:rPr>
+        <w:t>Priority:</w:t>
+      </w:r>
+      <w:r>
+        <w:t xml:space="preserve"> P2</w:t>
+      </w:r>
+    </w:p>
+    <w:p>
+      <w:pPr>
+        <w:pStyle w:val="ListBullet"/>
+      </w:pPr>
+      <w:r>
+        <w:rPr>
+          <w:b/>
+        </w:rPr>
+        <w:t>Title:</w:t>
+      </w:r>
+      <w:r>
+        <w:t xml:space="preserve"> Upsert and read the biographical personal-details satellite (single row per employee)</w:t>
+      </w:r>
+    </w:p>
+    <w:p>
+      <w:pPr>
+        <w:pStyle w:val="ListBullet"/>
+      </w:pPr>
+      <w:r>
+        <w:rPr>
+          <w:b/>
+        </w:rPr>
+        <w:t>Steps:</w:t>
+      </w:r>
+      <w:r>
+        <w:t xml:space="preserve"> 1. </w:t>
+      </w:r>
+      <w:r>
+        <w:rPr>
+          <w:rFonts w:ascii="Consolas" w:hAnsi="Consolas"/>
+          <w:sz w:val="20"/>
+        </w:rPr>
+        <w:t>PUT /api/v1/employees/{EMP-1001}/personal-details</w:t>
+      </w:r>
+      <w:r>
+        <w:t xml:space="preserve"> {country_of_birth:"India", place_of_birth:"Hyderabad", father_name:"Ramesh Verma", languages_spoken:["Telugu","English","Hindi"], linkedin_id:"in.linkedin.com/in/anjali-rao"} + Idempotency-Key. 2. </w:t>
+      </w:r>
+      <w:r>
+        <w:rPr>
+          <w:rFonts w:ascii="Consolas" w:hAnsi="Consolas"/>
+          <w:sz w:val="20"/>
+        </w:rPr>
+        <w:t>GET …/personal-details</w:t>
+      </w:r>
+      <w:r>
+        <w:t xml:space="preserve">. 3. </w:t>
+      </w:r>
+      <w:r>
+        <w:rPr>
+          <w:rFonts w:ascii="Consolas" w:hAnsi="Consolas"/>
+          <w:sz w:val="20"/>
+        </w:rPr>
+        <w:t>PUT</w:t>
+      </w:r>
+      <w:r>
+        <w:t xml:space="preserve"> again with an edited </w:t>
+      </w:r>
+      <w:r>
+        <w:rPr>
+          <w:rFonts w:ascii="Consolas" w:hAnsi="Consolas"/>
+          <w:sz w:val="20"/>
+        </w:rPr>
+        <w:t>place_of_birth</w:t>
+      </w:r>
+      <w:r>
+        <w:t>.</w:t>
+      </w:r>
+    </w:p>
+    <w:p>
+      <w:pPr>
+        <w:pStyle w:val="ListBullet"/>
+      </w:pPr>
+      <w:r>
+        <w:rPr>
+          <w:b/>
+        </w:rPr>
+        <w:t>Expected result:</w:t>
+      </w:r>
+      <w:r>
+        <w:t xml:space="preserve"> first </w:t>
+      </w:r>
+      <w:r>
+        <w:rPr>
+          <w:rFonts w:ascii="Consolas" w:hAnsi="Consolas"/>
+          <w:sz w:val="20"/>
+        </w:rPr>
+        <w:t>PUT</w:t>
+      </w:r>
+      <w:r>
+        <w:t xml:space="preserve"> </w:t>
+      </w:r>
+      <w:r>
+        <w:rPr>
+          <w:rFonts w:ascii="Consolas" w:hAnsi="Consolas"/>
+          <w:sz w:val="20"/>
+        </w:rPr>
+        <w:t>200</w:t>
+      </w:r>
+      <w:r>
+        <w:t xml:space="preserve"> upserts; </w:t>
+      </w:r>
+      <w:r>
+        <w:rPr>
+          <w:rFonts w:ascii="Consolas" w:hAnsi="Consolas"/>
+          <w:sz w:val="20"/>
+        </w:rPr>
+        <w:t>GET</w:t>
+      </w:r>
+      <w:r>
+        <w:t xml:space="preserve"> returns the row (masked per PII ceiling); second </w:t>
+      </w:r>
+      <w:r>
+        <w:rPr>
+          <w:rFonts w:ascii="Consolas" w:hAnsi="Consolas"/>
+          <w:sz w:val="20"/>
+        </w:rPr>
+        <w:t>PUT</w:t>
+      </w:r>
+      <w:r>
+        <w:t xml:space="preserve"> updates the same single row (1:1 uniqueness preserved, no duplicate); core golden record unchanged.</w:t>
+      </w:r>
+    </w:p>
+    <w:p>
+      <w:pPr>
+        <w:pStyle w:val="Heading4"/>
+      </w:pPr>
+      <w:r>
+        <w:rPr>
+          <w:b/>
+          <w:color w:val="2E5B9E"/>
+          <w:sz w:val="24"/>
+        </w:rPr>
+        <w:t>TC-G01-145</w:t>
+      </w:r>
+    </w:p>
+    <w:p>
+      <w:pPr>
+        <w:pStyle w:val="ListBullet"/>
+      </w:pPr>
+      <w:r>
+        <w:rPr>
+          <w:b/>
+        </w:rPr>
+        <w:t>Traces-to:</w:t>
+      </w:r>
+      <w:r>
+        <w:t xml:space="preserve"> FR-EPM-004 (v3.2 F6, </w:t>
+      </w:r>
+      <w:r>
+        <w:rPr>
+          <w:rFonts w:ascii="Consolas" w:hAnsi="Consolas"/>
+          <w:sz w:val="20"/>
+        </w:rPr>
+        <w:t>employee_dependent_details</w:t>
+      </w:r>
+      <w:r>
+        <w:t xml:space="preserve">, 1:1 per dependent); </w:t>
+      </w:r>
+      <w:r>
+        <w:rPr>
+          <w:rFonts w:ascii="Consolas" w:hAnsi="Consolas"/>
+          <w:sz w:val="20"/>
+        </w:rPr>
+        <w:t>GET</w:t>
+      </w:r>
+      <w:r>
+        <w:t>/</w:t>
+      </w:r>
+      <w:r>
+        <w:rPr>
+          <w:rFonts w:ascii="Consolas" w:hAnsi="Consolas"/>
+          <w:sz w:val="20"/>
+        </w:rPr>
+        <w:t>PUT /employees/{id}/dependents/{dependentId}/details</w:t>
+      </w:r>
+    </w:p>
+    <w:p>
+      <w:pPr>
+        <w:pStyle w:val="ListBullet"/>
+      </w:pPr>
+      <w:r>
+        <w:rPr>
+          <w:b/>
+        </w:rPr>
+        <w:t>Type:</w:t>
+      </w:r>
+      <w:r>
+        <w:t xml:space="preserve"> Functional · </w:t>
+      </w:r>
+      <w:r>
+        <w:rPr>
+          <w:b/>
+        </w:rPr>
+        <w:t>Priority:</w:t>
+      </w:r>
+      <w:r>
+        <w:t xml:space="preserve"> P3</w:t>
+      </w:r>
+    </w:p>
+    <w:p>
+      <w:pPr>
+        <w:pStyle w:val="ListBullet"/>
+      </w:pPr>
+      <w:r>
+        <w:rPr>
+          <w:b/>
+        </w:rPr>
+        <w:t>Title:</w:t>
+      </w:r>
+      <w:r>
+        <w:t xml:space="preserve"> Upsert and read a dependent's extras satellite (nationality / phone / insurance-covered)</w:t>
+      </w:r>
+    </w:p>
+    <w:p>
+      <w:pPr>
+        <w:pStyle w:val="ListBullet"/>
+      </w:pPr>
+      <w:r>
+        <w:rPr>
+          <w:b/>
+        </w:rPr>
+        <w:t>Steps:</w:t>
+      </w:r>
+      <w:r>
+        <w:t xml:space="preserve"> 1. Add a dependent (TC-024 pattern) → </w:t>
+      </w:r>
+      <w:r>
+        <w:rPr>
+          <w:rFonts w:ascii="Consolas" w:hAnsi="Consolas"/>
+          <w:sz w:val="20"/>
+        </w:rPr>
+        <w:t>dependentId</w:t>
+      </w:r>
+      <w:r>
+        <w:t xml:space="preserve">. 2. </w:t>
+      </w:r>
+      <w:r>
+        <w:rPr>
+          <w:rFonts w:ascii="Consolas" w:hAnsi="Consolas"/>
+          <w:sz w:val="20"/>
+        </w:rPr>
+        <w:t>PUT /api/v1/employees/{EMP-1001}/dependents/{dependentId}/details</w:t>
+      </w:r>
+      <w:r>
+        <w:t xml:space="preserve"> {nationality:"Indian", phone:"+91 98XXXX4455", same_as_employee_address:true, is_covered_group_insurance:true} + Idempotency-Key. 3. </w:t>
+      </w:r>
+      <w:r>
+        <w:rPr>
+          <w:rFonts w:ascii="Consolas" w:hAnsi="Consolas"/>
+          <w:sz w:val="20"/>
+        </w:rPr>
+        <w:t>GET …/details</w:t>
+      </w:r>
+      <w:r>
+        <w:t>.</w:t>
+      </w:r>
+    </w:p>
+    <w:p>
+      <w:pPr>
+        <w:pStyle w:val="ListBullet"/>
+      </w:pPr>
+      <w:r>
+        <w:rPr>
+          <w:b/>
+        </w:rPr>
+        <w:t>Expected result:</w:t>
+      </w:r>
+      <w:r>
+        <w:t xml:space="preserve"> </w:t>
+      </w:r>
+      <w:r>
+        <w:rPr>
+          <w:rFonts w:ascii="Consolas" w:hAnsi="Consolas"/>
+          <w:sz w:val="20"/>
+        </w:rPr>
+        <w:t>PUT</w:t>
+      </w:r>
+      <w:r>
+        <w:t xml:space="preserve"> </w:t>
+      </w:r>
+      <w:r>
+        <w:rPr>
+          <w:rFonts w:ascii="Consolas" w:hAnsi="Consolas"/>
+          <w:sz w:val="20"/>
+        </w:rPr>
+        <w:t>200</w:t>
+      </w:r>
+      <w:r>
+        <w:t xml:space="preserve"> upserts the 1:1 satellite; </w:t>
+      </w:r>
+      <w:r>
+        <w:rPr>
+          <w:rFonts w:ascii="Consolas" w:hAnsi="Consolas"/>
+          <w:sz w:val="20"/>
+        </w:rPr>
+        <w:t>GET</w:t>
+      </w:r>
+      <w:r>
+        <w:t xml:space="preserve"> returns </w:t>
+      </w:r>
+      <w:r>
+        <w:rPr>
+          <w:rFonts w:ascii="Consolas" w:hAnsi="Consolas"/>
+          <w:sz w:val="20"/>
+        </w:rPr>
+        <w:t>is_covered_group_insurance=true</w:t>
+      </w:r>
+      <w:r>
+        <w:t xml:space="preserve"> ("Insurance covered" in the detail grid); core </w:t>
+      </w:r>
+      <w:r>
+        <w:rPr>
+          <w:rFonts w:ascii="Consolas" w:hAnsi="Consolas"/>
+          <w:sz w:val="20"/>
+        </w:rPr>
+        <w:t>employee_dependents</w:t>
+      </w:r>
+      <w:r>
+        <w:t xml:space="preserve"> row not redefined.</w:t>
+      </w:r>
+    </w:p>
+    <w:p>
+      <w:pPr>
+        <w:pStyle w:val="Heading4"/>
+      </w:pPr>
+      <w:r>
+        <w:rPr>
+          <w:b/>
+          <w:color w:val="2E5B9E"/>
+          <w:sz w:val="24"/>
+        </w:rPr>
+        <w:t>TC-G01-146</w:t>
+      </w:r>
+    </w:p>
+    <w:p>
+      <w:pPr>
+        <w:pStyle w:val="ListBullet"/>
+      </w:pPr>
+      <w:r>
+        <w:rPr>
+          <w:b/>
+        </w:rPr>
+        <w:t>Traces-to:</w:t>
+      </w:r>
+      <w:r>
+        <w:t xml:space="preserve"> FR-EPM-006 (v3.2 F9/F10); </w:t>
+      </w:r>
+      <w:r>
+        <w:rPr>
+          <w:rFonts w:ascii="Consolas" w:hAnsi="Consolas"/>
+          <w:sz w:val="20"/>
+        </w:rPr>
+        <w:t>employee_education.start_year</w:t>
+      </w:r>
+      <w:r>
+        <w:t>/</w:t>
+      </w:r>
+      <w:r>
+        <w:rPr>
+          <w:rFonts w:ascii="Consolas" w:hAnsi="Consolas"/>
+          <w:sz w:val="20"/>
+        </w:rPr>
+        <w:t>grade_type</w:t>
+      </w:r>
+      <w:r>
+        <w:t xml:space="preserve">, </w:t>
+      </w:r>
+      <w:r>
+        <w:rPr>
+          <w:rFonts w:ascii="Consolas" w:hAnsi="Consolas"/>
+          <w:sz w:val="20"/>
+        </w:rPr>
+        <w:t>employee_experience.job_description</w:t>
+      </w:r>
+      <w:r>
+        <w:t xml:space="preserve">; </w:t>
+      </w:r>
+      <w:r>
+        <w:rPr>
+          <w:rFonts w:ascii="Consolas" w:hAnsi="Consolas"/>
+          <w:sz w:val="20"/>
+        </w:rPr>
+        <w:t>POST /employees/{id}/education</w:t>
+      </w:r>
+      <w:r>
+        <w:t>,</w:t>
+      </w:r>
+      <w:r>
+        <w:rPr>
+          <w:rFonts w:ascii="Consolas" w:hAnsi="Consolas"/>
+          <w:sz w:val="20"/>
+        </w:rPr>
+        <w:t>/experience</w:t>
+      </w:r>
+    </w:p>
+    <w:p>
+      <w:pPr>
+        <w:pStyle w:val="ListBullet"/>
+      </w:pPr>
+      <w:r>
+        <w:rPr>
+          <w:b/>
+        </w:rPr>
+        <w:t>Type:</w:t>
+      </w:r>
+      <w:r>
+        <w:t xml:space="preserve"> Functional · </w:t>
+      </w:r>
+      <w:r>
+        <w:rPr>
+          <w:b/>
+        </w:rPr>
+        <w:t>Priority:</w:t>
+      </w:r>
+      <w:r>
+        <w:t xml:space="preserve"> P2</w:t>
+      </w:r>
+    </w:p>
+    <w:p>
+      <w:pPr>
+        <w:pStyle w:val="ListBullet"/>
+      </w:pPr>
+      <w:r>
+        <w:rPr>
+          <w:b/>
+        </w:rPr>
+        <w:t>Title:</w:t>
+      </w:r>
+      <w:r>
+        <w:t xml:space="preserve"> Education </w:t>
+      </w:r>
+      <w:r>
+        <w:rPr>
+          <w:rFonts w:ascii="Consolas" w:hAnsi="Consolas"/>
+          <w:sz w:val="20"/>
+        </w:rPr>
+        <w:t>start_year</w:t>
+      </w:r>
+      <w:r>
+        <w:t>/</w:t>
+      </w:r>
+      <w:r>
+        <w:rPr>
+          <w:rFonts w:ascii="Consolas" w:hAnsi="Consolas"/>
+          <w:sz w:val="20"/>
+        </w:rPr>
+        <w:t>grade_type</w:t>
+      </w:r>
+      <w:r>
+        <w:t xml:space="preserve"> and experience </w:t>
+      </w:r>
+      <w:r>
+        <w:rPr>
+          <w:rFonts w:ascii="Consolas" w:hAnsi="Consolas"/>
+          <w:sz w:val="20"/>
+        </w:rPr>
+        <w:t>job_description</w:t>
+      </w:r>
+      <w:r>
+        <w:t xml:space="preserve"> are persisted and returned</w:t>
+      </w:r>
+    </w:p>
+    <w:p>
+      <w:pPr>
+        <w:pStyle w:val="ListBullet"/>
+      </w:pPr>
+      <w:r>
+        <w:rPr>
+          <w:b/>
+        </w:rPr>
+        <w:t>Steps:</w:t>
+      </w:r>
+      <w:r>
+        <w:t xml:space="preserve"> 1. </w:t>
+      </w:r>
+      <w:r>
+        <w:rPr>
+          <w:rFonts w:ascii="Consolas" w:hAnsi="Consolas"/>
+          <w:sz w:val="20"/>
+        </w:rPr>
+        <w:t>POST /api/v1/employees/{EMP-1001}/education</w:t>
+      </w:r>
+      <w:r>
+        <w:t xml:space="preserve"> {level:"UG", start_year:2008, grade_type:"CGPA"} (value in </w:t>
+      </w:r>
+      <w:r>
+        <w:rPr>
+          <w:rFonts w:ascii="Consolas" w:hAnsi="Consolas"/>
+          <w:sz w:val="20"/>
+        </w:rPr>
+        <w:t>grade_or_percentage</w:t>
+      </w:r>
+      <w:r>
+        <w:t xml:space="preserve">). 2. </w:t>
+      </w:r>
+      <w:r>
+        <w:rPr>
+          <w:rFonts w:ascii="Consolas" w:hAnsi="Consolas"/>
+          <w:sz w:val="20"/>
+        </w:rPr>
+        <w:t>POST …/experience</w:t>
+      </w:r>
+      <w:r>
+        <w:t xml:space="preserve"> {employer:"Prev Co", from_date:"2010-01-01", job_description:"Backend engineer on payments"}.</w:t>
+      </w:r>
+    </w:p>
+    <w:p>
+      <w:pPr>
+        <w:pStyle w:val="ListBullet"/>
+      </w:pPr>
+      <w:r>
+        <w:rPr>
+          <w:b/>
+        </w:rPr>
+        <w:t>Expected result:</w:t>
+      </w:r>
+      <w:r>
+        <w:t xml:space="preserve"> both </w:t>
+      </w:r>
+      <w:r>
+        <w:rPr>
+          <w:rFonts w:ascii="Consolas" w:hAnsi="Consolas"/>
+          <w:sz w:val="20"/>
+        </w:rPr>
+        <w:t>201</w:t>
+      </w:r>
+      <w:r>
+        <w:t xml:space="preserve">; </w:t>
+      </w:r>
+      <w:r>
+        <w:rPr>
+          <w:rFonts w:ascii="Consolas" w:hAnsi="Consolas"/>
+          <w:sz w:val="20"/>
+        </w:rPr>
+        <w:t>GET</w:t>
+      </w:r>
+      <w:r>
+        <w:t xml:space="preserve"> shows </w:t>
+      </w:r>
+      <w:r>
+        <w:rPr>
+          <w:rFonts w:ascii="Consolas" w:hAnsi="Consolas"/>
+          <w:sz w:val="20"/>
+        </w:rPr>
+        <w:t>start_year=2008</w:t>
+      </w:r>
+      <w:r>
+        <w:t xml:space="preserve">, </w:t>
+      </w:r>
+      <w:r>
+        <w:rPr>
+          <w:rFonts w:ascii="Consolas" w:hAnsi="Consolas"/>
+          <w:sz w:val="20"/>
+        </w:rPr>
+        <w:t>grade_type="CGPA"</w:t>
+      </w:r>
+      <w:r>
+        <w:t xml:space="preserve"> on the education record and </w:t>
+      </w:r>
+      <w:r>
+        <w:rPr>
+          <w:rFonts w:ascii="Consolas" w:hAnsi="Consolas"/>
+          <w:sz w:val="20"/>
+        </w:rPr>
+        <w:t>job_description</w:t>
+      </w:r>
+      <w:r>
+        <w:t xml:space="preserve"> on the experience record (additive fields; existing behaviour unchanged).</w:t>
+      </w:r>
+    </w:p>
+    <w:p>
+      <w:pPr>
+        <w:pStyle w:val="Heading4"/>
+      </w:pPr>
+      <w:r>
+        <w:rPr>
+          <w:b/>
+          <w:color w:val="2E5B9E"/>
+          <w:sz w:val="24"/>
+        </w:rPr>
+        <w:t>TC-G01-147</w:t>
+      </w:r>
+    </w:p>
+    <w:p>
+      <w:pPr>
+        <w:pStyle w:val="ListBullet"/>
+      </w:pPr>
+      <w:r>
+        <w:rPr>
+          <w:b/>
+        </w:rPr>
+        <w:t>Traces-to:</w:t>
+      </w:r>
+      <w:r>
+        <w:t xml:space="preserve"> FR-EPM-006 (v3.2); </w:t>
+      </w:r>
+      <w:r>
+        <w:rPr>
+          <w:rFonts w:ascii="Consolas" w:hAnsi="Consolas"/>
+          <w:sz w:val="20"/>
+        </w:rPr>
+        <w:t>ck_employee_education_start_year</w:t>
+      </w:r>
+      <w:r>
+        <w:t xml:space="preserve"> (1950..2100); error-taxonomy VALIDATION_FAILED</w:t>
+      </w:r>
+    </w:p>
+    <w:p>
+      <w:pPr>
+        <w:pStyle w:val="ListBullet"/>
+      </w:pPr>
+      <w:r>
+        <w:rPr>
+          <w:b/>
+        </w:rPr>
+        <w:t>Type:</w:t>
+      </w:r>
+      <w:r>
+        <w:t xml:space="preserve"> Negative · </w:t>
+      </w:r>
+      <w:r>
+        <w:rPr>
+          <w:b/>
+        </w:rPr>
+        <w:t>Priority:</w:t>
+      </w:r>
+      <w:r>
+        <w:t xml:space="preserve"> P2</w:t>
+      </w:r>
+    </w:p>
+    <w:p>
+      <w:pPr>
+        <w:pStyle w:val="ListBullet"/>
+      </w:pPr>
+      <w:r>
+        <w:rPr>
+          <w:b/>
+        </w:rPr>
+        <w:t>Title:</w:t>
+      </w:r>
+      <w:r>
+        <w:t xml:space="preserve"> Education </w:t>
+      </w:r>
+      <w:r>
+        <w:rPr>
+          <w:rFonts w:ascii="Consolas" w:hAnsi="Consolas"/>
+          <w:sz w:val="20"/>
+        </w:rPr>
+        <w:t>start_year</w:t>
+      </w:r>
+      <w:r>
+        <w:t xml:space="preserve"> outside 1950–2100 is rejected</w:t>
+      </w:r>
+    </w:p>
+    <w:p>
+      <w:pPr>
+        <w:pStyle w:val="ListBullet"/>
+      </w:pPr>
+      <w:r>
+        <w:rPr>
+          <w:b/>
+        </w:rPr>
+        <w:t>Steps:</w:t>
+      </w:r>
+      <w:r>
+        <w:t xml:space="preserve"> 1. </w:t>
+      </w:r>
+      <w:r>
+        <w:rPr>
+          <w:rFonts w:ascii="Consolas" w:hAnsi="Consolas"/>
+          <w:sz w:val="20"/>
+        </w:rPr>
+        <w:t>POST /api/v1/employees/{EMP-1001}/education</w:t>
+      </w:r>
+      <w:r>
+        <w:t xml:space="preserve"> {level:"UG", start_year:1000, grade_type:"GPA"}.</w:t>
+      </w:r>
+    </w:p>
+    <w:p>
+      <w:pPr>
+        <w:pStyle w:val="ListBullet"/>
+      </w:pPr>
+      <w:r>
+        <w:rPr>
+          <w:b/>
+        </w:rPr>
+        <w:t>Expected result:</w:t>
+      </w:r>
+      <w:r>
+        <w:t xml:space="preserve"> </w:t>
+      </w:r>
+      <w:r>
+        <w:rPr>
+          <w:rFonts w:ascii="Consolas" w:hAnsi="Consolas"/>
+          <w:sz w:val="20"/>
+        </w:rPr>
+        <w:t>422 VALIDATION_FAILED</w:t>
+      </w:r>
+      <w:r>
+        <w:t xml:space="preserve">; </w:t>
+      </w:r>
+      <w:r>
+        <w:rPr>
+          <w:rFonts w:ascii="Consolas" w:hAnsi="Consolas"/>
+          <w:sz w:val="20"/>
+        </w:rPr>
+        <w:t>field="start_year"</w:t>
+      </w:r>
+      <w:r>
+        <w:t>; nothing persisted.</w:t>
+      </w:r>
+    </w:p>
+    <w:p>
+      <w:pPr>
+        <w:pStyle w:val="Heading4"/>
+      </w:pPr>
+      <w:r>
+        <w:rPr>
+          <w:b/>
+          <w:color w:val="2E5B9E"/>
+          <w:sz w:val="24"/>
+        </w:rPr>
+        <w:t>TC-G01-148</w:t>
+      </w:r>
+    </w:p>
+    <w:p>
+      <w:pPr>
+        <w:pStyle w:val="ListBullet"/>
+      </w:pPr>
+      <w:r>
+        <w:rPr>
+          <w:b/>
+        </w:rPr>
+        <w:t>Traces-to:</w:t>
+      </w:r>
+      <w:r>
+        <w:t xml:space="preserve"> FR-EPM-012 (v3.2 F8/F12, custom-field framework columns); </w:t>
+      </w:r>
+      <w:r>
+        <w:rPr>
+          <w:rFonts w:ascii="Consolas" w:hAnsi="Consolas"/>
+          <w:sz w:val="20"/>
+        </w:rPr>
+        <w:t>custom_field_definitions.external_field_id</w:t>
+      </w:r>
+      <w:r>
+        <w:t>/</w:t>
+      </w:r>
+      <w:r>
+        <w:rPr>
+          <w:rFonts w:ascii="Consolas" w:hAnsi="Consolas"/>
+          <w:sz w:val="20"/>
+        </w:rPr>
+        <w:t>display_target</w:t>
+      </w:r>
+      <w:r>
+        <w:t>/</w:t>
+      </w:r>
+      <w:r>
+        <w:rPr>
+          <w:rFonts w:ascii="Consolas" w:hAnsi="Consolas"/>
+          <w:sz w:val="20"/>
+        </w:rPr>
+        <w:t>for_object</w:t>
+      </w:r>
+      <w:r>
+        <w:t>/</w:t>
+      </w:r>
+      <w:r>
+        <w:rPr>
+          <w:rFonts w:ascii="Consolas" w:hAnsi="Consolas"/>
+          <w:sz w:val="20"/>
+        </w:rPr>
+        <w:t>is_editable</w:t>
+      </w:r>
+      <w:r>
+        <w:t>/</w:t>
+      </w:r>
+      <w:r>
+        <w:rPr>
+          <w:rFonts w:ascii="Consolas" w:hAnsi="Consolas"/>
+          <w:sz w:val="20"/>
+        </w:rPr>
+        <w:t>allow_decimals</w:t>
+      </w:r>
+      <w:r>
+        <w:t>/</w:t>
+      </w:r>
+      <w:r>
+        <w:rPr>
+          <w:rFonts w:ascii="Consolas" w:hAnsi="Consolas"/>
+          <w:sz w:val="20"/>
+        </w:rPr>
+        <w:t>number_separator</w:t>
+      </w:r>
+      <w:r>
+        <w:t xml:space="preserve">; nullable </w:t>
+      </w:r>
+      <w:r>
+        <w:rPr>
+          <w:rFonts w:ascii="Consolas" w:hAnsi="Consolas"/>
+          <w:sz w:val="20"/>
+        </w:rPr>
+        <w:t>section_id</w:t>
+      </w:r>
+      <w:r>
+        <w:t>; CUSTOM_FIELD_TYPE += DROPDOWN</w:t>
+      </w:r>
+    </w:p>
+    <w:p>
+      <w:pPr>
+        <w:pStyle w:val="ListBullet"/>
+      </w:pPr>
+      <w:r>
+        <w:rPr>
+          <w:b/>
+        </w:rPr>
+        <w:t>Type:</w:t>
+      </w:r>
+      <w:r>
+        <w:t xml:space="preserve"> API-Contract · </w:t>
+      </w:r>
+      <w:r>
+        <w:rPr>
+          <w:b/>
+        </w:rPr>
+        <w:t>Priority:</w:t>
+      </w:r>
+      <w:r>
+        <w:t xml:space="preserve"> P3</w:t>
+      </w:r>
+    </w:p>
+    <w:p>
+      <w:pPr>
+        <w:pStyle w:val="ListBullet"/>
+      </w:pPr>
+      <w:r>
+        <w:rPr>
+          <w:b/>
+        </w:rPr>
+        <w:t>Title:</w:t>
+      </w:r>
+      <w:r>
+        <w:t xml:space="preserve"> Custom-field definition carries the v3.2 framework columns and a non-profile-section target</w:t>
+      </w:r>
+    </w:p>
+    <w:p>
+      <w:pPr>
+        <w:pStyle w:val="ListBullet"/>
+      </w:pPr>
+      <w:r>
+        <w:rPr>
+          <w:b/>
+        </w:rPr>
+        <w:t>Steps:</w:t>
+      </w:r>
+      <w:r>
+        <w:t xml:space="preserve"> 1. Define a custom field {field_key:"reason_for_letter", data_type:"DROPDOWN", external_field_id:"a64902e57de4a6", display_target:"HR Documents", for_object:"Others", is_editable:false, section_id:null} (Phase-2 config surface). 2. Read it back.</w:t>
+      </w:r>
+    </w:p>
+    <w:p>
+      <w:pPr>
+        <w:pStyle w:val="ListBullet"/>
+      </w:pPr>
+      <w:r>
+        <w:rPr>
+          <w:b/>
+        </w:rPr>
+        <w:t>Expected result:</w:t>
+      </w:r>
+      <w:r>
+        <w:t xml:space="preserve"> the definition persists with </w:t>
+      </w:r>
+      <w:r>
+        <w:rPr>
+          <w:rFonts w:ascii="Consolas" w:hAnsi="Consolas"/>
+          <w:sz w:val="20"/>
+        </w:rPr>
+        <w:t>section_id=null</w:t>
+      </w:r>
+      <w:r>
+        <w:t xml:space="preserve"> (targets an arbitrary HR object, not only a profile section), the CSV framework attributes are echoed, and </w:t>
+      </w:r>
+      <w:r>
+        <w:rPr>
+          <w:rFonts w:ascii="Consolas" w:hAnsi="Consolas"/>
+          <w:sz w:val="20"/>
+        </w:rPr>
+        <w:t>data_type="DROPDOWN"</w:t>
+      </w:r>
+      <w:r>
+        <w:t xml:space="preserve"> is accepted (extended CUSTOM_FIELD_TYPE); </w:t>
+      </w:r>
+      <w:r>
+        <w:rPr>
+          <w:rFonts w:ascii="Consolas" w:hAnsi="Consolas"/>
+          <w:sz w:val="20"/>
+        </w:rPr>
+        <w:t>external_field_id</w:t>
+      </w:r>
+      <w:r>
+        <w:t xml:space="preserve"> unique per tenant. (FR-EPM-012 remains Phase-2 deferred; this asserts the reconciled contract shape only.)</w:t>
+      </w:r>
+    </w:p>
+    <w:p>
+      <w:pPr>
         <w:pStyle w:val="Heading2"/>
       </w:pPr>
       <w:r>
@@ -20484,7 +23695,7 @@
               <w:rPr>
                 <w:sz w:val="18"/>
               </w:rPr>
-              <w:t>TC-G01-001, 002, 003, 004, 005, 006, 007, 008, 009, 010, 011</w:t>
+              <w:t>TC-G01-001, 002, 003, 004, 005, 006, 007, 008, 009, 010, 011 (+144 personal-details)</w:t>
             </w:r>
           </w:p>
         </w:tc>
@@ -20497,7 +23708,7 @@
               <w:rPr>
                 <w:sz w:val="18"/>
               </w:rPr>
-              <w:t>Happy E2E + mononym + all key negatives (mandatory, age, DOJ, dedup-block, sanction) + atomicity + exemption</w:t>
+              <w:t>Happy E2E + mononym + all key negatives (mandatory, age, DOJ, dedup-block, sanction) + atomicity + exemption + v3.2 biographical satellite</w:t>
             </w:r>
           </w:p>
         </w:tc>
@@ -20607,7 +23818,7 @@
               <w:rPr>
                 <w:sz w:val="18"/>
               </w:rPr>
-              <w:t>TC-G01-024, 025, 026, 027, 028, 029</w:t>
+              <w:t>TC-G01-024, 025, 026, 027, 028, 029 (+145 dependent-details)</w:t>
             </w:r>
           </w:p>
         </w:tc>
@@ -20620,7 +23831,7 @@
               <w:rPr>
                 <w:sz w:val="18"/>
               </w:rPr>
-              <w:t>Share sum happy + SHARE_SUM_INVALID + minor guardian + SoD 4-eyes + heir + delete guard</w:t>
+              <w:t>Share sum happy + SHARE_SUM_INVALID + minor guardian + SoD 4-eyes + heir + delete guard + v3.2 dependent extras satellite (insurance-covered)</w:t>
             </w:r>
           </w:p>
         </w:tc>
@@ -20689,7 +23900,7 @@
               <w:rPr>
                 <w:sz w:val="18"/>
               </w:rPr>
-              <w:t>TC-G01-033, 034, 035, 036</w:t>
+              <w:t>TC-G01-033, 034, 035, 036 (+135, 136, 137 visas; 138, 139 prof-certs; 140, 141 skills; 146, 147 education/experience v3.2 cols)</w:t>
             </w:r>
           </w:p>
         </w:tc>
@@ -20702,7 +23913,7 @@
               <w:rPr>
                 <w:sz w:val="18"/>
               </w:rPr>
-              <w:t>One-highest + IMMUTABLE_VERIFIED + bounds + gov-service/SR</w:t>
+              <w:t>One-highest + IMMUTABLE_VERIFIED + bounds + gov-service/SR + v3.2 visas (add/list/expiry/date-guard) + professional certifications + profile skills + education start_year/grade_type + experience job_description</w:t>
             </w:r>
           </w:p>
         </w:tc>
@@ -20730,7 +23941,7 @@
               <w:rPr>
                 <w:sz w:val="18"/>
               </w:rPr>
-              <w:t>TC-G01-037, 038, 039, 040, 041, 042, 043, 044, 045</w:t>
+              <w:t>TC-G01-037, 038, 039, 040, 041, 042, 043, 044, 045 (+131, 132 national-id-types master; 133, 134 typed/temporary-id doc)</w:t>
             </w:r>
           </w:p>
         </w:tc>
@@ -20743,7 +23954,7 @@
               <w:rPr>
                 <w:sz w:val="18"/>
               </w:rPr>
-              <w:t>Vault single-home + INVALID_ID + lawful_basis + no-raw-read + 4-eyes reveal + REASON_REQUIRED + dup-hash + KMS fail-closed + expiry</w:t>
+              <w:t>Vault single-home + INVALID_ID + lawful_basis + no-raw-read + 4-eyes reveal + REASON_REQUIRED + dup-hash + KMS fail-closed + expiry + v3.2 configurable national-ID master (config/dup) + national_id_type-linked doc with temporary-id</w:t>
             </w:r>
           </w:p>
         </w:tc>
@@ -20771,7 +23982,7 @@
               <w:rPr>
                 <w:sz w:val="18"/>
               </w:rPr>
-              <w:t>TC-G01-046, 047, 048, 049, 050, 051</w:t>
+              <w:t>TC-G01-046, 047, 048, 049, 050, 051 (+142, 143 penny-drop)</w:t>
             </w:r>
           </w:p>
         </w:tc>
@@ -20784,7 +23995,7 @@
               <w:rPr>
                 <w:sz w:val="18"/>
               </w:rPr>
-              <w:t>4-eyes state + SoD + IFSC + never-blocks-pay + STALE + reject</w:t>
+              <w:t>4-eyes state + SoD + IFSC + never-blocks-pay + STALE + reject + v3.2 penny-drop tri-state (VERIFIED / FAILED)</w:t>
             </w:r>
           </w:p>
         </w:tc>
@@ -20935,7 +24146,7 @@
               <w:rPr>
                 <w:sz w:val="18"/>
               </w:rPr>
-              <w:t>TC-G01-065</w:t>
+              <w:t>TC-G01-065 (+148 v3.2 framework columns)</w:t>
             </w:r>
           </w:p>
         </w:tc>
@@ -20948,7 +24159,7 @@
               <w:rPr>
                 <w:sz w:val="18"/>
               </w:rPr>
-              <w:t>Phase-2 deferred config surface (empty in v1) — flagged deferred</w:t>
+              <w:t>Phase-2 deferred config surface (empty in v1) — flagged deferred + v3.2 custom-field framework columns / non-section target contract shape</w:t>
             </w:r>
           </w:p>
         </w:tc>
@@ -21526,10 +24737,10 @@
         <w:rPr>
           <w:b/>
         </w:rPr>
-        <w:t>Total test cases: 130</w:t>
-      </w:r>
-      <w:r>
-        <w:t xml:space="preserve"> (TC-G01-001 … TC-G01-130).</w:t>
+        <w:t>Total test cases: 148</w:t>
+      </w:r>
+      <w:r>
+        <w:t xml:space="preserve"> (TC-G01-001 … TC-G01-148). *(TC-131 … TC-148 are the v3.2 field-reconciliation additions.)*</w:t>
       </w:r>
     </w:p>
     <w:p>
@@ -22051,7 +25262,7 @@
               <w:rPr>
                 <w:sz w:val="18"/>
               </w:rPr>
-              <w:t>30</w:t>
+              <w:t>36</w:t>
             </w:r>
           </w:p>
         </w:tc>
@@ -22079,7 +25290,7 @@
               <w:rPr>
                 <w:sz w:val="18"/>
               </w:rPr>
-              <w:t>23</w:t>
+              <w:t>32</w:t>
             </w:r>
           </w:p>
         </w:tc>
@@ -22122,7 +25333,7 @@
               <w:rPr>
                 <w:sz w:val="18"/>
               </w:rPr>
-              <w:t>Authorization</w:t>
+              <w:t>State-Transition</w:t>
             </w:r>
           </w:p>
         </w:tc>
@@ -22150,7 +25361,7 @@
               <w:rPr>
                 <w:sz w:val="18"/>
               </w:rPr>
-              <w:t>State-Transition</w:t>
+              <w:t>Authorization</w:t>
             </w:r>
           </w:p>
         </w:tc>
@@ -22163,7 +25374,7 @@
               <w:rPr>
                 <w:sz w:val="18"/>
               </w:rPr>
-              <w:t>11</w:t>
+              <w:t>13</w:t>
             </w:r>
           </w:p>
         </w:tc>
@@ -22219,7 +25430,7 @@
               <w:rPr>
                 <w:sz w:val="18"/>
               </w:rPr>
-              <w:t>8</w:t>
+              <w:t>9</w:t>
             </w:r>
           </w:p>
         </w:tc>
@@ -22305,13 +25516,18 @@
                 <w:b/>
                 <w:sz w:val="18"/>
               </w:rPr>
-              <w:t>130</w:t>
+              <w:t>148</w:t>
             </w:r>
           </w:p>
         </w:tc>
       </w:tr>
     </w:tbl>
     <w:p/>
+    <w:p>
+      <w:r>
+        <w:t>*v3.2 additions (TC-131…148) by primary type: Functional 9 (131,133,135,136,138,140,144,145,146), Negative 6 (132,134,137,139,141,147), State-Transition 2 (142,143), API-Contract 1 (148).*</w:t>
+      </w:r>
+    </w:p>
     <w:p>
       <w:pPr>
         <w:pStyle w:val="Heading3"/>
@@ -22410,7 +25626,7 @@
               <w:rPr>
                 <w:sz w:val="18"/>
               </w:rPr>
-              <w:t>55</w:t>
+              <w:t>57</w:t>
             </w:r>
           </w:p>
         </w:tc>
@@ -22423,7 +25639,7 @@
               <w:rPr>
                 <w:sz w:val="18"/>
               </w:rPr>
-              <w:t>Statutory correctness, security (Aadhaar/vault/break-glass), SoD/4-eyes, data-integrity invariants, tenant isolation, SR-post contract, error-code accuracy</w:t>
+              <w:t>Statutory correctness, security (Aadhaar/vault/break-glass), SoD/4-eyes, data-integrity invariants, tenant isolation, SR-post contract, error-code accuracy, typed/temporary-id statutory doc</w:t>
             </w:r>
           </w:p>
         </w:tc>
@@ -22451,7 +25667,7 @@
               <w:rPr>
                 <w:sz w:val="18"/>
               </w:rPr>
-              <w:t>52</w:t>
+              <w:t>64</w:t>
             </w:r>
           </w:p>
         </w:tc>
@@ -22464,7 +25680,7 @@
               <w:rPr>
                 <w:sz w:val="18"/>
               </w:rPr>
-              <w:t>Core functional flows, state machines, effective-dating, consumption API, privacy/retention</w:t>
+              <w:t>Core functional flows, state machines, effective-dating, consumption API, privacy/retention, v3.2 national-ID master + visas/certs/skills + penny-drop + personal-details</w:t>
             </w:r>
           </w:p>
         </w:tc>
@@ -22492,7 +25708,7 @@
               <w:rPr>
                 <w:sz w:val="18"/>
               </w:rPr>
-              <w:t>23</w:t>
+              <w:t>27</w:t>
             </w:r>
           </w:p>
         </w:tc>
@@ -22505,7 +25721,7 @@
               <w:rPr>
                 <w:sz w:val="18"/>
               </w:rPr>
-              <w:t>Advisory (completeness/DQ), certificates, UX ordering, performance-adjacent, secondary reports</w:t>
+              <w:t>Advisory (completeness/DQ), certificates, UX ordering, performance-adjacent, secondary/expiry reports, v3.2 skills/dependent-details/custom-field framework</w:t>
             </w:r>
           </w:p>
         </w:tc>
@@ -22697,7 +25913,56 @@
         <w:t>ERR-DUP-INSTANCE</w:t>
       </w:r>
       <w:r>
-        <w:t>/DUPLICATE_CANDIDATE (006), UNAUTHENTICATED (124), NOT_FOUND/tenant (096).</w:t>
+        <w:t xml:space="preserve">/DUPLICATE_CANDIDATE (006), UNAUTHENTICATED (124), NOT_FOUND/tenant (096). </w:t>
+      </w:r>
+      <w:r>
+        <w:rPr>
+          <w:b/>
+        </w:rPr>
+        <w:t>v3.2 additions:</w:t>
+      </w:r>
+      <w:r>
+        <w:t xml:space="preserve"> </w:t>
+      </w:r>
+      <w:r>
+        <w:rPr>
+          <w:rFonts w:ascii="Consolas" w:hAnsi="Consolas"/>
+          <w:sz w:val="20"/>
+        </w:rPr>
+        <w:t>ERR-G01-IDFMT</w:t>
+      </w:r>
+      <w:r>
+        <w:t xml:space="preserve">/INVALID_ID also asserted on a national_id_type-linked doc (134); </w:t>
+      </w:r>
+      <w:r>
+        <w:rPr>
+          <w:rFonts w:ascii="Consolas" w:hAnsi="Consolas"/>
+          <w:sz w:val="20"/>
+        </w:rPr>
+        <w:t>VALIDATION_FAILED</w:t>
+      </w:r>
+      <w:r>
+        <w:t xml:space="preserve"> on visa/cert date-order and education start_year range (137, 139, 147); </w:t>
+      </w:r>
+      <w:r>
+        <w:rPr>
+          <w:rFonts w:ascii="Consolas" w:hAnsi="Consolas"/>
+          <w:sz w:val="20"/>
+        </w:rPr>
+        <w:t>CONFLICT</w:t>
+      </w:r>
+      <w:r>
+        <w:t xml:space="preserve"> on duplicate national-ID </w:t>
+      </w:r>
+      <w:r>
+        <w:rPr>
+          <w:rFonts w:ascii="Consolas" w:hAnsi="Consolas"/>
+          <w:sz w:val="20"/>
+        </w:rPr>
+        <w:t>id_code</w:t>
+      </w:r>
+      <w:r>
+        <w:t xml:space="preserve"> (132) and duplicate skill name (141).</w:t>
       </w:r>
     </w:p>
     <w:sectPr>

</xml_diff>